<commit_message>
partie 2 : images web et MySQL
</commit_message>
<xml_diff>
--- a/Rapport-LAUMOND_COURCHAY.docx
+++ b/Rapport-LAUMOND_COURCHAY.docx
@@ -2834,6 +2834,1439 @@
         <w:t>L’image MySQL crée la base et le compte applicatif à partir de MYSQL_DATABASE, MYSQL_USER et MYSQL_PASSWORD. Ce compte accepte les connexions des autres conteneurs du réseau. Le script déposé dans /docker-entrypoint-initdb.d/ crée uniquement la table articles.</w:t>
       </w:r>
     </w:p>
+    <w:p>
+      <w:pPr>
+        <w:pStyle w:val="Heading1"/>
+        <w:spacing w:before="280" w:after="120"/>
+      </w:pPr>
+      <w:r>
+        <w:rPr>
+          <w:rFonts w:ascii="Calibri" w:hAnsi="Calibri" w:cs="Calibri" w:eastAsia="Calibri"/>
+          <w:b/>
+          <w:i w:val="0"/>
+          <w:color w:val="1F4E79"/>
+          <w:sz w:val="32"/>
+        </w:rPr>
+        <w:t>Partie 2 — Images</w:t>
+      </w:r>
+    </w:p>
+    <w:p>
+      <w:pPr>
+        <w:spacing w:before="0" w:after="160" w:line="259" w:lineRule="auto"/>
+      </w:pPr>
+      <w:r>
+        <w:rPr>
+          <w:rFonts w:ascii="Calibri" w:hAnsi="Calibri" w:cs="Calibri" w:eastAsia="Calibri"/>
+          <w:b w:val="0"/>
+          <w:i w:val="0"/>
+          <w:color w:val="1B2836"/>
+          <w:sz w:val="22"/>
+        </w:rPr>
+        <w:t>Deux images suffisent. Le service web est construit à partir de php:8.2-apache. Le service db reprend mysql:8.4 et y ajoute uniquement le script de création de la table. Les mots de passe restent hors de ces fichiers. Ils sont fournis au lancement, par les variables d’environnement.</w:t>
+      </w:r>
+    </w:p>
+    <w:p>
+      <w:pPr>
+        <w:pStyle w:val="Heading2"/>
+        <w:spacing w:before="240" w:after="120"/>
+      </w:pPr>
+      <w:r>
+        <w:rPr>
+          <w:rFonts w:ascii="Calibri" w:hAnsi="Calibri" w:cs="Calibri" w:eastAsia="Calibri"/>
+          <w:b/>
+          <w:i w:val="0"/>
+          <w:color w:val="1F4E79"/>
+          <w:sz w:val="26"/>
+        </w:rPr>
+        <w:t>1. Service web</w:t>
+      </w:r>
+    </w:p>
+    <w:p>
+      <w:pPr>
+        <w:spacing w:before="0" w:after="160" w:line="259" w:lineRule="auto"/>
+      </w:pPr>
+      <w:r>
+        <w:rPr>
+          <w:rFonts w:ascii="Calibri" w:hAnsi="Calibri" w:cs="Calibri" w:eastAsia="Calibri"/>
+          <w:b w:val="0"/>
+          <w:i w:val="0"/>
+          <w:color w:val="1B2836"/>
+          <w:sz w:val="22"/>
+        </w:rPr>
+        <w:t>Le Dockerfile à la racine produit l’image web. Apache écoute sur le port 80, le processus tourne avec l’utilisateur www-data déjà présent dans l’image Debian (uid 33). Il n’y a pas de second compte à créer.</w:t>
+      </w:r>
+    </w:p>
+    <w:tbl>
+      <w:tblPr>
+        <w:tblW w:type="dxa" w:w="9600"/>
+        <w:tblLayout w:type="fixed"/>
+        <w:tblLook w:firstColumn="1" w:firstRow="1" w:lastColumn="0" w:lastRow="0" w:noHBand="0" w:noVBand="1" w:val="04A0"/>
+      </w:tblPr>
+      <w:tblGrid>
+        <w:gridCol w:w="4200"/>
+        <w:gridCol w:w="5400"/>
+      </w:tblGrid>
+      <w:tr>
+        <w:trPr>
+          <w:cantSplit/>
+        </w:trPr>
+        <w:tc>
+          <w:tcPr>
+            <w:tcW w:type="dxa" w:w="4200"/>
+            <w:shd w:val="clear" w:color="auto" w:fill="1F4E79"/>
+            <w:tcBorders>
+              <w:top w:val="single" w:sz="4" w:space="0" w:color="D0D7DE"/>
+              <w:left w:val="single" w:sz="4" w:space="0" w:color="D0D7DE"/>
+              <w:bottom w:val="single" w:sz="4" w:space="0" w:color="D0D7DE"/>
+              <w:right w:val="single" w:sz="4" w:space="0" w:color="D0D7DE"/>
+            </w:tcBorders>
+            <w:tcMar>
+              <w:top w:w="60" w:type="dxa"/>
+              <w:left w:w="80" w:type="dxa"/>
+              <w:bottom w:w="60" w:type="dxa"/>
+              <w:right w:w="80" w:type="dxa"/>
+            </w:tcMar>
+          </w:tcPr>
+          <w:p>
+            <w:pPr>
+              <w:spacing w:before="0" w:after="0"/>
+            </w:pPr>
+            <w:r/>
+            <w:r>
+              <w:rPr>
+                <w:rFonts w:ascii="Calibri" w:hAnsi="Calibri" w:cs="Calibri" w:eastAsia="Calibri"/>
+                <w:b/>
+                <w:i w:val="0"/>
+                <w:color w:val="FFFFFF"/>
+                <w:sz w:val="21"/>
+              </w:rPr>
+              <w:t>Instruction</w:t>
+            </w:r>
+          </w:p>
+        </w:tc>
+        <w:tc>
+          <w:tcPr>
+            <w:tcW w:type="dxa" w:w="5400"/>
+            <w:shd w:val="clear" w:color="auto" w:fill="1F4E79"/>
+            <w:tcBorders>
+              <w:top w:val="single" w:sz="4" w:space="0" w:color="D0D7DE"/>
+              <w:left w:val="single" w:sz="4" w:space="0" w:color="D0D7DE"/>
+              <w:bottom w:val="single" w:sz="4" w:space="0" w:color="D0D7DE"/>
+              <w:right w:val="single" w:sz="4" w:space="0" w:color="D0D7DE"/>
+            </w:tcBorders>
+            <w:tcMar>
+              <w:top w:w="60" w:type="dxa"/>
+              <w:left w:w="80" w:type="dxa"/>
+              <w:bottom w:w="60" w:type="dxa"/>
+              <w:right w:w="80" w:type="dxa"/>
+            </w:tcMar>
+          </w:tcPr>
+          <w:p>
+            <w:pPr>
+              <w:spacing w:before="0" w:after="0"/>
+            </w:pPr>
+            <w:r/>
+            <w:r>
+              <w:rPr>
+                <w:rFonts w:ascii="Calibri" w:hAnsi="Calibri" w:cs="Calibri" w:eastAsia="Calibri"/>
+                <w:b/>
+                <w:i w:val="0"/>
+                <w:color w:val="FFFFFF"/>
+                <w:sz w:val="21"/>
+              </w:rPr>
+              <w:t>Rôle</w:t>
+            </w:r>
+          </w:p>
+        </w:tc>
+      </w:tr>
+      <w:tr>
+        <w:trPr>
+          <w:cantSplit/>
+        </w:trPr>
+        <w:tc>
+          <w:tcPr>
+            <w:tcW w:type="dxa" w:w="4200"/>
+            <w:tcBorders>
+              <w:top w:val="single" w:sz="4" w:space="0" w:color="D0D7DE"/>
+              <w:left w:val="single" w:sz="4" w:space="0" w:color="D0D7DE"/>
+              <w:bottom w:val="single" w:sz="4" w:space="0" w:color="D0D7DE"/>
+              <w:right w:val="single" w:sz="4" w:space="0" w:color="D0D7DE"/>
+            </w:tcBorders>
+            <w:tcMar>
+              <w:top w:w="60" w:type="dxa"/>
+              <w:left w:w="80" w:type="dxa"/>
+              <w:bottom w:w="60" w:type="dxa"/>
+              <w:right w:w="80" w:type="dxa"/>
+            </w:tcMar>
+          </w:tcPr>
+          <w:p>
+            <w:pPr>
+              <w:spacing w:before="0" w:after="0"/>
+            </w:pPr>
+            <w:r/>
+            <w:r>
+              <w:rPr>
+                <w:rFonts w:ascii="Calibri" w:hAnsi="Calibri" w:cs="Calibri" w:eastAsia="Calibri"/>
+                <w:b/>
+                <w:i w:val="0"/>
+                <w:color w:val="1B2836"/>
+                <w:sz w:val="21"/>
+              </w:rPr>
+              <w:t>FROM php:8.2-apache</w:t>
+            </w:r>
+          </w:p>
+        </w:tc>
+        <w:tc>
+          <w:tcPr>
+            <w:tcW w:type="dxa" w:w="5400"/>
+            <w:tcBorders>
+              <w:top w:val="single" w:sz="4" w:space="0" w:color="D0D7DE"/>
+              <w:left w:val="single" w:sz="4" w:space="0" w:color="D0D7DE"/>
+              <w:bottom w:val="single" w:sz="4" w:space="0" w:color="D0D7DE"/>
+              <w:right w:val="single" w:sz="4" w:space="0" w:color="D0D7DE"/>
+            </w:tcBorders>
+            <w:tcMar>
+              <w:top w:w="60" w:type="dxa"/>
+              <w:left w:w="80" w:type="dxa"/>
+              <w:bottom w:w="60" w:type="dxa"/>
+              <w:right w:w="80" w:type="dxa"/>
+            </w:tcMar>
+          </w:tcPr>
+          <w:p>
+            <w:pPr>
+              <w:spacing w:before="0" w:after="0"/>
+            </w:pPr>
+            <w:r/>
+            <w:r>
+              <w:rPr>
+                <w:rFonts w:ascii="Calibri" w:hAnsi="Calibri" w:cs="Calibri" w:eastAsia="Calibri"/>
+                <w:b w:val="0"/>
+                <w:i w:val="0"/>
+                <w:color w:val="1B2836"/>
+                <w:sz w:val="21"/>
+              </w:rPr>
+              <w:t>Image officielle. PHP et Apache sont déjà assemblés. Le tag fixe la branche 8.2.</w:t>
+            </w:r>
+          </w:p>
+        </w:tc>
+      </w:tr>
+      <w:tr>
+        <w:trPr>
+          <w:cantSplit/>
+        </w:trPr>
+        <w:tc>
+          <w:tcPr>
+            <w:tcW w:type="dxa" w:w="4200"/>
+            <w:tcBorders>
+              <w:top w:val="single" w:sz="4" w:space="0" w:color="D0D7DE"/>
+              <w:left w:val="single" w:sz="4" w:space="0" w:color="D0D7DE"/>
+              <w:bottom w:val="single" w:sz="4" w:space="0" w:color="D0D7DE"/>
+              <w:right w:val="single" w:sz="4" w:space="0" w:color="D0D7DE"/>
+            </w:tcBorders>
+            <w:tcMar>
+              <w:top w:w="60" w:type="dxa"/>
+              <w:left w:w="80" w:type="dxa"/>
+              <w:bottom w:w="60" w:type="dxa"/>
+              <w:right w:w="80" w:type="dxa"/>
+            </w:tcMar>
+            <w:shd w:val="clear" w:color="auto" w:fill="F4F7FB"/>
+          </w:tcPr>
+          <w:p>
+            <w:pPr>
+              <w:spacing w:before="0" w:after="0"/>
+            </w:pPr>
+            <w:r/>
+            <w:r>
+              <w:rPr>
+                <w:rFonts w:ascii="Calibri" w:hAnsi="Calibri" w:cs="Calibri" w:eastAsia="Calibri"/>
+                <w:b/>
+                <w:i w:val="0"/>
+                <w:color w:val="1B2836"/>
+                <w:sz w:val="21"/>
+              </w:rPr>
+              <w:t>apt-get install libcap2-bin</w:t>
+            </w:r>
+          </w:p>
+        </w:tc>
+        <w:tc>
+          <w:tcPr>
+            <w:tcW w:type="dxa" w:w="5400"/>
+            <w:tcBorders>
+              <w:top w:val="single" w:sz="4" w:space="0" w:color="D0D7DE"/>
+              <w:left w:val="single" w:sz="4" w:space="0" w:color="D0D7DE"/>
+              <w:bottom w:val="single" w:sz="4" w:space="0" w:color="D0D7DE"/>
+              <w:right w:val="single" w:sz="4" w:space="0" w:color="D0D7DE"/>
+            </w:tcBorders>
+            <w:tcMar>
+              <w:top w:w="60" w:type="dxa"/>
+              <w:left w:w="80" w:type="dxa"/>
+              <w:bottom w:w="60" w:type="dxa"/>
+              <w:right w:w="80" w:type="dxa"/>
+            </w:tcMar>
+            <w:shd w:val="clear" w:color="auto" w:fill="F4F7FB"/>
+          </w:tcPr>
+          <w:p>
+            <w:pPr>
+              <w:spacing w:before="0" w:after="0"/>
+            </w:pPr>
+            <w:r/>
+            <w:r>
+              <w:rPr>
+                <w:rFonts w:ascii="Calibri" w:hAnsi="Calibri" w:cs="Calibri" w:eastAsia="Calibri"/>
+                <w:b w:val="0"/>
+                <w:i w:val="0"/>
+                <w:color w:val="1B2836"/>
+                <w:sz w:val="21"/>
+              </w:rPr>
+              <w:t>Fournit setcap, utilisé pour autoriser le port 80 sans être root.</w:t>
+            </w:r>
+          </w:p>
+        </w:tc>
+      </w:tr>
+      <w:tr>
+        <w:trPr>
+          <w:cantSplit/>
+        </w:trPr>
+        <w:tc>
+          <w:tcPr>
+            <w:tcW w:type="dxa" w:w="4200"/>
+            <w:tcBorders>
+              <w:top w:val="single" w:sz="4" w:space="0" w:color="D0D7DE"/>
+              <w:left w:val="single" w:sz="4" w:space="0" w:color="D0D7DE"/>
+              <w:bottom w:val="single" w:sz="4" w:space="0" w:color="D0D7DE"/>
+              <w:right w:val="single" w:sz="4" w:space="0" w:color="D0D7DE"/>
+            </w:tcBorders>
+            <w:tcMar>
+              <w:top w:w="60" w:type="dxa"/>
+              <w:left w:w="80" w:type="dxa"/>
+              <w:bottom w:w="60" w:type="dxa"/>
+              <w:right w:w="80" w:type="dxa"/>
+            </w:tcMar>
+          </w:tcPr>
+          <w:p>
+            <w:pPr>
+              <w:spacing w:before="0" w:after="0"/>
+            </w:pPr>
+            <w:r/>
+            <w:r>
+              <w:rPr>
+                <w:rFonts w:ascii="Calibri" w:hAnsi="Calibri" w:cs="Calibri" w:eastAsia="Calibri"/>
+                <w:b/>
+                <w:i w:val="0"/>
+                <w:color w:val="1B2836"/>
+                <w:sz w:val="21"/>
+              </w:rPr>
+              <w:t>docker-php-ext-install pdo_mysql mysqli</w:t>
+            </w:r>
+          </w:p>
+        </w:tc>
+        <w:tc>
+          <w:tcPr>
+            <w:tcW w:type="dxa" w:w="5400"/>
+            <w:tcBorders>
+              <w:top w:val="single" w:sz="4" w:space="0" w:color="D0D7DE"/>
+              <w:left w:val="single" w:sz="4" w:space="0" w:color="D0D7DE"/>
+              <w:bottom w:val="single" w:sz="4" w:space="0" w:color="D0D7DE"/>
+              <w:right w:val="single" w:sz="4" w:space="0" w:color="D0D7DE"/>
+            </w:tcBorders>
+            <w:tcMar>
+              <w:top w:w="60" w:type="dxa"/>
+              <w:left w:w="80" w:type="dxa"/>
+              <w:bottom w:w="60" w:type="dxa"/>
+              <w:right w:w="80" w:type="dxa"/>
+            </w:tcMar>
+          </w:tcPr>
+          <w:p>
+            <w:pPr>
+              <w:spacing w:before="0" w:after="0"/>
+            </w:pPr>
+            <w:r/>
+            <w:r>
+              <w:rPr>
+                <w:rFonts w:ascii="Calibri" w:hAnsi="Calibri" w:cs="Calibri" w:eastAsia="Calibri"/>
+                <w:b w:val="0"/>
+                <w:i w:val="0"/>
+                <w:color w:val="1B2836"/>
+                <w:sz w:val="21"/>
+              </w:rPr>
+              <w:t>Le code ouvre MySQL avec PDO. L’extension mysqli est installée en plus, pour disposer des deux pilotes.</w:t>
+            </w:r>
+          </w:p>
+        </w:tc>
+      </w:tr>
+      <w:tr>
+        <w:trPr>
+          <w:cantSplit/>
+        </w:trPr>
+        <w:tc>
+          <w:tcPr>
+            <w:tcW w:type="dxa" w:w="4200"/>
+            <w:tcBorders>
+              <w:top w:val="single" w:sz="4" w:space="0" w:color="D0D7DE"/>
+              <w:left w:val="single" w:sz="4" w:space="0" w:color="D0D7DE"/>
+              <w:bottom w:val="single" w:sz="4" w:space="0" w:color="D0D7DE"/>
+              <w:right w:val="single" w:sz="4" w:space="0" w:color="D0D7DE"/>
+            </w:tcBorders>
+            <w:tcMar>
+              <w:top w:w="60" w:type="dxa"/>
+              <w:left w:w="80" w:type="dxa"/>
+              <w:bottom w:w="60" w:type="dxa"/>
+              <w:right w:w="80" w:type="dxa"/>
+            </w:tcMar>
+            <w:shd w:val="clear" w:color="auto" w:fill="F4F7FB"/>
+          </w:tcPr>
+          <w:p>
+            <w:pPr>
+              <w:spacing w:before="0" w:after="0"/>
+            </w:pPr>
+            <w:r/>
+            <w:r>
+              <w:rPr>
+                <w:rFonts w:ascii="Calibri" w:hAnsi="Calibri" w:cs="Calibri" w:eastAsia="Calibri"/>
+                <w:b/>
+                <w:i w:val="0"/>
+                <w:color w:val="1B2836"/>
+                <w:sz w:val="21"/>
+              </w:rPr>
+              <w:t>setcap cap_net_bind_service</w:t>
+            </w:r>
+          </w:p>
+        </w:tc>
+        <w:tc>
+          <w:tcPr>
+            <w:tcW w:type="dxa" w:w="5400"/>
+            <w:tcBorders>
+              <w:top w:val="single" w:sz="4" w:space="0" w:color="D0D7DE"/>
+              <w:left w:val="single" w:sz="4" w:space="0" w:color="D0D7DE"/>
+              <w:bottom w:val="single" w:sz="4" w:space="0" w:color="D0D7DE"/>
+              <w:right w:val="single" w:sz="4" w:space="0" w:color="D0D7DE"/>
+            </w:tcBorders>
+            <w:tcMar>
+              <w:top w:w="60" w:type="dxa"/>
+              <w:left w:w="80" w:type="dxa"/>
+              <w:bottom w:w="60" w:type="dxa"/>
+              <w:right w:w="80" w:type="dxa"/>
+            </w:tcMar>
+            <w:shd w:val="clear" w:color="auto" w:fill="F4F7FB"/>
+          </w:tcPr>
+          <w:p>
+            <w:pPr>
+              <w:spacing w:before="0" w:after="0"/>
+            </w:pPr>
+            <w:r/>
+            <w:r>
+              <w:rPr>
+                <w:rFonts w:ascii="Calibri" w:hAnsi="Calibri" w:cs="Calibri" w:eastAsia="Calibri"/>
+                <w:b w:val="0"/>
+                <w:i w:val="0"/>
+                <w:color w:val="1B2836"/>
+                <w:sz w:val="21"/>
+              </w:rPr>
+              <w:t>Pose la capacité sur /usr/sbin/apache2. www-data peut alors ouvrir le port 80.</w:t>
+            </w:r>
+          </w:p>
+        </w:tc>
+      </w:tr>
+      <w:tr>
+        <w:trPr>
+          <w:cantSplit/>
+        </w:trPr>
+        <w:tc>
+          <w:tcPr>
+            <w:tcW w:type="dxa" w:w="4200"/>
+            <w:tcBorders>
+              <w:top w:val="single" w:sz="4" w:space="0" w:color="D0D7DE"/>
+              <w:left w:val="single" w:sz="4" w:space="0" w:color="D0D7DE"/>
+              <w:bottom w:val="single" w:sz="4" w:space="0" w:color="D0D7DE"/>
+              <w:right w:val="single" w:sz="4" w:space="0" w:color="D0D7DE"/>
+            </w:tcBorders>
+            <w:tcMar>
+              <w:top w:w="60" w:type="dxa"/>
+              <w:left w:w="80" w:type="dxa"/>
+              <w:bottom w:w="60" w:type="dxa"/>
+              <w:right w:w="80" w:type="dxa"/>
+            </w:tcMar>
+          </w:tcPr>
+          <w:p>
+            <w:pPr>
+              <w:spacing w:before="0" w:after="0"/>
+            </w:pPr>
+            <w:r/>
+            <w:r>
+              <w:rPr>
+                <w:rFonts w:ascii="Calibri" w:hAnsi="Calibri" w:cs="Calibri" w:eastAsia="Calibri"/>
+                <w:b/>
+                <w:i w:val="0"/>
+                <w:color w:val="1B2836"/>
+                <w:sz w:val="21"/>
+              </w:rPr>
+              <w:t>chown des dossiers Apache</w:t>
+            </w:r>
+          </w:p>
+        </w:tc>
+        <w:tc>
+          <w:tcPr>
+            <w:tcW w:type="dxa" w:w="5400"/>
+            <w:tcBorders>
+              <w:top w:val="single" w:sz="4" w:space="0" w:color="D0D7DE"/>
+              <w:left w:val="single" w:sz="4" w:space="0" w:color="D0D7DE"/>
+              <w:bottom w:val="single" w:sz="4" w:space="0" w:color="D0D7DE"/>
+              <w:right w:val="single" w:sz="4" w:space="0" w:color="D0D7DE"/>
+            </w:tcBorders>
+            <w:tcMar>
+              <w:top w:w="60" w:type="dxa"/>
+              <w:left w:w="80" w:type="dxa"/>
+              <w:bottom w:w="60" w:type="dxa"/>
+              <w:right w:w="80" w:type="dxa"/>
+            </w:tcMar>
+          </w:tcPr>
+          <w:p>
+            <w:pPr>
+              <w:spacing w:before="0" w:after="0"/>
+            </w:pPr>
+            <w:r/>
+            <w:r>
+              <w:rPr>
+                <w:rFonts w:ascii="Calibri" w:hAnsi="Calibri" w:cs="Calibri" w:eastAsia="Calibri"/>
+                <w:b w:val="0"/>
+                <w:i w:val="0"/>
+                <w:color w:val="1B2836"/>
+                <w:sz w:val="21"/>
+              </w:rPr>
+              <w:t>Le fichier PID et les journaux sont écrits dans /var/run/apache2, /var/lock/apache2 et /var/log/apache2. www-data doit en être propriétaire.</w:t>
+            </w:r>
+          </w:p>
+        </w:tc>
+      </w:tr>
+      <w:tr>
+        <w:trPr>
+          <w:cantSplit/>
+        </w:trPr>
+        <w:tc>
+          <w:tcPr>
+            <w:tcW w:type="dxa" w:w="4200"/>
+            <w:tcBorders>
+              <w:top w:val="single" w:sz="4" w:space="0" w:color="D0D7DE"/>
+              <w:left w:val="single" w:sz="4" w:space="0" w:color="D0D7DE"/>
+              <w:bottom w:val="single" w:sz="4" w:space="0" w:color="D0D7DE"/>
+              <w:right w:val="single" w:sz="4" w:space="0" w:color="D0D7DE"/>
+            </w:tcBorders>
+            <w:tcMar>
+              <w:top w:w="60" w:type="dxa"/>
+              <w:left w:w="80" w:type="dxa"/>
+              <w:bottom w:w="60" w:type="dxa"/>
+              <w:right w:w="80" w:type="dxa"/>
+            </w:tcMar>
+            <w:shd w:val="clear" w:color="auto" w:fill="F4F7FB"/>
+          </w:tcPr>
+          <w:p>
+            <w:pPr>
+              <w:spacing w:before="0" w:after="0"/>
+            </w:pPr>
+            <w:r/>
+            <w:r>
+              <w:rPr>
+                <w:rFonts w:ascii="Calibri" w:hAnsi="Calibri" w:cs="Calibri" w:eastAsia="Calibri"/>
+                <w:b/>
+                <w:i w:val="0"/>
+                <w:color w:val="1B2836"/>
+                <w:sz w:val="21"/>
+              </w:rPr>
+              <w:t>apt-get clean et suppression des listes</w:t>
+            </w:r>
+          </w:p>
+        </w:tc>
+        <w:tc>
+          <w:tcPr>
+            <w:tcW w:type="dxa" w:w="5400"/>
+            <w:tcBorders>
+              <w:top w:val="single" w:sz="4" w:space="0" w:color="D0D7DE"/>
+              <w:left w:val="single" w:sz="4" w:space="0" w:color="D0D7DE"/>
+              <w:bottom w:val="single" w:sz="4" w:space="0" w:color="D0D7DE"/>
+              <w:right w:val="single" w:sz="4" w:space="0" w:color="D0D7DE"/>
+            </w:tcBorders>
+            <w:tcMar>
+              <w:top w:w="60" w:type="dxa"/>
+              <w:left w:w="80" w:type="dxa"/>
+              <w:bottom w:w="60" w:type="dxa"/>
+              <w:right w:w="80" w:type="dxa"/>
+            </w:tcMar>
+            <w:shd w:val="clear" w:color="auto" w:fill="F4F7FB"/>
+          </w:tcPr>
+          <w:p>
+            <w:pPr>
+              <w:spacing w:before="0" w:after="0"/>
+            </w:pPr>
+            <w:r/>
+            <w:r>
+              <w:rPr>
+                <w:rFonts w:ascii="Calibri" w:hAnsi="Calibri" w:cs="Calibri" w:eastAsia="Calibri"/>
+                <w:b w:val="0"/>
+                <w:i w:val="0"/>
+                <w:color w:val="1B2836"/>
+                <w:sz w:val="21"/>
+              </w:rPr>
+              <w:t>Les index de paquets ne servent plus une fois les extensions installées. Les retirer allège la couche.</w:t>
+            </w:r>
+          </w:p>
+        </w:tc>
+      </w:tr>
+      <w:tr>
+        <w:trPr>
+          <w:cantSplit/>
+        </w:trPr>
+        <w:tc>
+          <w:tcPr>
+            <w:tcW w:type="dxa" w:w="4200"/>
+            <w:tcBorders>
+              <w:top w:val="single" w:sz="4" w:space="0" w:color="D0D7DE"/>
+              <w:left w:val="single" w:sz="4" w:space="0" w:color="D0D7DE"/>
+              <w:bottom w:val="single" w:sz="4" w:space="0" w:color="D0D7DE"/>
+              <w:right w:val="single" w:sz="4" w:space="0" w:color="D0D7DE"/>
+            </w:tcBorders>
+            <w:tcMar>
+              <w:top w:w="60" w:type="dxa"/>
+              <w:left w:w="80" w:type="dxa"/>
+              <w:bottom w:w="60" w:type="dxa"/>
+              <w:right w:w="80" w:type="dxa"/>
+            </w:tcMar>
+          </w:tcPr>
+          <w:p>
+            <w:pPr>
+              <w:spacing w:before="0" w:after="0"/>
+            </w:pPr>
+            <w:r/>
+            <w:r>
+              <w:rPr>
+                <w:rFonts w:ascii="Calibri" w:hAnsi="Calibri" w:cs="Calibri" w:eastAsia="Calibri"/>
+                <w:b/>
+                <w:i w:val="0"/>
+                <w:color w:val="1B2836"/>
+                <w:sz w:val="21"/>
+              </w:rPr>
+              <w:t>COPY app.conf, a2ensite app</w:t>
+            </w:r>
+          </w:p>
+        </w:tc>
+        <w:tc>
+          <w:tcPr>
+            <w:tcW w:type="dxa" w:w="5400"/>
+            <w:tcBorders>
+              <w:top w:val="single" w:sz="4" w:space="0" w:color="D0D7DE"/>
+              <w:left w:val="single" w:sz="4" w:space="0" w:color="D0D7DE"/>
+              <w:bottom w:val="single" w:sz="4" w:space="0" w:color="D0D7DE"/>
+              <w:right w:val="single" w:sz="4" w:space="0" w:color="D0D7DE"/>
+            </w:tcBorders>
+            <w:tcMar>
+              <w:top w:w="60" w:type="dxa"/>
+              <w:left w:w="80" w:type="dxa"/>
+              <w:bottom w:w="60" w:type="dxa"/>
+              <w:right w:w="80" w:type="dxa"/>
+            </w:tcMar>
+          </w:tcPr>
+          <w:p>
+            <w:pPr>
+              <w:spacing w:before="0" w:after="0"/>
+            </w:pPr>
+            <w:r/>
+            <w:r>
+              <w:rPr>
+                <w:rFonts w:ascii="Calibri" w:hAnsi="Calibri" w:cs="Calibri" w:eastAsia="Calibri"/>
+                <w:b w:val="0"/>
+                <w:i w:val="0"/>
+                <w:color w:val="1B2836"/>
+                <w:sz w:val="21"/>
+              </w:rPr>
+              <w:t>a2dissite retire le site par défaut. a2ensite active app.conf. Le DocumentRoot est /var/www/html. Options -Indexes retire le listing des dossiers. AllowOverride None ignore les .htaccess. Le module PHP est déjà chargé par l’image. rewrite reste désactivé : les adresses sont des fichiers, index.php et validation.php.</w:t>
+            </w:r>
+          </w:p>
+        </w:tc>
+      </w:tr>
+      <w:tr>
+        <w:trPr>
+          <w:cantSplit/>
+        </w:trPr>
+        <w:tc>
+          <w:tcPr>
+            <w:tcW w:type="dxa" w:w="4200"/>
+            <w:tcBorders>
+              <w:top w:val="single" w:sz="4" w:space="0" w:color="D0D7DE"/>
+              <w:left w:val="single" w:sz="4" w:space="0" w:color="D0D7DE"/>
+              <w:bottom w:val="single" w:sz="4" w:space="0" w:color="D0D7DE"/>
+              <w:right w:val="single" w:sz="4" w:space="0" w:color="D0D7DE"/>
+            </w:tcBorders>
+            <w:tcMar>
+              <w:top w:w="60" w:type="dxa"/>
+              <w:left w:w="80" w:type="dxa"/>
+              <w:bottom w:w="60" w:type="dxa"/>
+              <w:right w:w="80" w:type="dxa"/>
+            </w:tcMar>
+            <w:shd w:val="clear" w:color="auto" w:fill="F4F7FB"/>
+          </w:tcPr>
+          <w:p>
+            <w:pPr>
+              <w:spacing w:before="0" w:after="0"/>
+            </w:pPr>
+            <w:r/>
+            <w:r>
+              <w:rPr>
+                <w:rFonts w:ascii="Calibri" w:hAnsi="Calibri" w:cs="Calibri" w:eastAsia="Calibri"/>
+                <w:b/>
+                <w:i w:val="0"/>
+                <w:color w:val="1B2836"/>
+                <w:sz w:val="21"/>
+              </w:rPr>
+              <w:t>COPY --chown sources/app</w:t>
+            </w:r>
+          </w:p>
+        </w:tc>
+        <w:tc>
+          <w:tcPr>
+            <w:tcW w:type="dxa" w:w="5400"/>
+            <w:tcBorders>
+              <w:top w:val="single" w:sz="4" w:space="0" w:color="D0D7DE"/>
+              <w:left w:val="single" w:sz="4" w:space="0" w:color="D0D7DE"/>
+              <w:bottom w:val="single" w:sz="4" w:space="0" w:color="D0D7DE"/>
+              <w:right w:val="single" w:sz="4" w:space="0" w:color="D0D7DE"/>
+            </w:tcBorders>
+            <w:tcMar>
+              <w:top w:w="60" w:type="dxa"/>
+              <w:left w:w="80" w:type="dxa"/>
+              <w:bottom w:w="60" w:type="dxa"/>
+              <w:right w:w="80" w:type="dxa"/>
+            </w:tcMar>
+            <w:shd w:val="clear" w:color="auto" w:fill="F4F7FB"/>
+          </w:tcPr>
+          <w:p>
+            <w:pPr>
+              <w:spacing w:before="0" w:after="0"/>
+            </w:pPr>
+            <w:r/>
+            <w:r>
+              <w:rPr>
+                <w:rFonts w:ascii="Calibri" w:hAnsi="Calibri" w:cs="Calibri" w:eastAsia="Calibri"/>
+                <w:b w:val="0"/>
+                <w:i w:val="0"/>
+                <w:color w:val="1B2836"/>
+                <w:sz w:val="21"/>
+              </w:rPr>
+              <w:t>Le code est copié dans /var/www/html et appartient à www-data. Les droits du dépôt sont gardés.</w:t>
+            </w:r>
+          </w:p>
+        </w:tc>
+      </w:tr>
+      <w:tr>
+        <w:trPr>
+          <w:cantSplit/>
+        </w:trPr>
+        <w:tc>
+          <w:tcPr>
+            <w:tcW w:type="dxa" w:w="4200"/>
+            <w:tcBorders>
+              <w:top w:val="single" w:sz="4" w:space="0" w:color="D0D7DE"/>
+              <w:left w:val="single" w:sz="4" w:space="0" w:color="D0D7DE"/>
+              <w:bottom w:val="single" w:sz="4" w:space="0" w:color="D0D7DE"/>
+              <w:right w:val="single" w:sz="4" w:space="0" w:color="D0D7DE"/>
+            </w:tcBorders>
+            <w:tcMar>
+              <w:top w:w="60" w:type="dxa"/>
+              <w:left w:w="80" w:type="dxa"/>
+              <w:bottom w:w="60" w:type="dxa"/>
+              <w:right w:w="80" w:type="dxa"/>
+            </w:tcMar>
+          </w:tcPr>
+          <w:p>
+            <w:pPr>
+              <w:spacing w:before="0" w:after="0"/>
+            </w:pPr>
+            <w:r/>
+            <w:r>
+              <w:rPr>
+                <w:rFonts w:ascii="Calibri" w:hAnsi="Calibri" w:cs="Calibri" w:eastAsia="Calibri"/>
+                <w:b/>
+                <w:i w:val="0"/>
+                <w:color w:val="1B2836"/>
+                <w:sz w:val="21"/>
+              </w:rPr>
+              <w:t>USER www-data</w:t>
+            </w:r>
+          </w:p>
+        </w:tc>
+        <w:tc>
+          <w:tcPr>
+            <w:tcW w:type="dxa" w:w="5400"/>
+            <w:tcBorders>
+              <w:top w:val="single" w:sz="4" w:space="0" w:color="D0D7DE"/>
+              <w:left w:val="single" w:sz="4" w:space="0" w:color="D0D7DE"/>
+              <w:bottom w:val="single" w:sz="4" w:space="0" w:color="D0D7DE"/>
+              <w:right w:val="single" w:sz="4" w:space="0" w:color="D0D7DE"/>
+            </w:tcBorders>
+            <w:tcMar>
+              <w:top w:w="60" w:type="dxa"/>
+              <w:left w:w="80" w:type="dxa"/>
+              <w:bottom w:w="60" w:type="dxa"/>
+              <w:right w:w="80" w:type="dxa"/>
+            </w:tcMar>
+          </w:tcPr>
+          <w:p>
+            <w:pPr>
+              <w:spacing w:before="0" w:after="0"/>
+            </w:pPr>
+            <w:r/>
+            <w:r>
+              <w:rPr>
+                <w:rFonts w:ascii="Calibri" w:hAnsi="Calibri" w:cs="Calibri" w:eastAsia="Calibri"/>
+                <w:b w:val="0"/>
+                <w:i w:val="0"/>
+                <w:color w:val="1B2836"/>
+                <w:sz w:val="21"/>
+              </w:rPr>
+              <w:t>Le processus du conteneur n’est pas root. La vérification id renvoie uid 33.</w:t>
+            </w:r>
+          </w:p>
+        </w:tc>
+      </w:tr>
+      <w:tr>
+        <w:trPr>
+          <w:cantSplit/>
+        </w:trPr>
+        <w:tc>
+          <w:tcPr>
+            <w:tcW w:type="dxa" w:w="4200"/>
+            <w:tcBorders>
+              <w:top w:val="single" w:sz="4" w:space="0" w:color="D0D7DE"/>
+              <w:left w:val="single" w:sz="4" w:space="0" w:color="D0D7DE"/>
+              <w:bottom w:val="single" w:sz="4" w:space="0" w:color="D0D7DE"/>
+              <w:right w:val="single" w:sz="4" w:space="0" w:color="D0D7DE"/>
+            </w:tcBorders>
+            <w:tcMar>
+              <w:top w:w="60" w:type="dxa"/>
+              <w:left w:w="80" w:type="dxa"/>
+              <w:bottom w:w="60" w:type="dxa"/>
+              <w:right w:w="80" w:type="dxa"/>
+            </w:tcMar>
+            <w:shd w:val="clear" w:color="auto" w:fill="F4F7FB"/>
+          </w:tcPr>
+          <w:p>
+            <w:pPr>
+              <w:spacing w:before="0" w:after="0"/>
+            </w:pPr>
+            <w:r/>
+            <w:r>
+              <w:rPr>
+                <w:rFonts w:ascii="Calibri" w:hAnsi="Calibri" w:cs="Calibri" w:eastAsia="Calibri"/>
+                <w:b/>
+                <w:i w:val="0"/>
+                <w:color w:val="1B2836"/>
+                <w:sz w:val="21"/>
+              </w:rPr>
+              <w:t>EXPOSE 80</w:t>
+            </w:r>
+          </w:p>
+        </w:tc>
+        <w:tc>
+          <w:tcPr>
+            <w:tcW w:type="dxa" w:w="5400"/>
+            <w:tcBorders>
+              <w:top w:val="single" w:sz="4" w:space="0" w:color="D0D7DE"/>
+              <w:left w:val="single" w:sz="4" w:space="0" w:color="D0D7DE"/>
+              <w:bottom w:val="single" w:sz="4" w:space="0" w:color="D0D7DE"/>
+              <w:right w:val="single" w:sz="4" w:space="0" w:color="D0D7DE"/>
+            </w:tcBorders>
+            <w:tcMar>
+              <w:top w:w="60" w:type="dxa"/>
+              <w:left w:w="80" w:type="dxa"/>
+              <w:bottom w:w="60" w:type="dxa"/>
+              <w:right w:w="80" w:type="dxa"/>
+            </w:tcMar>
+            <w:shd w:val="clear" w:color="auto" w:fill="F4F7FB"/>
+          </w:tcPr>
+          <w:p>
+            <w:pPr>
+              <w:spacing w:before="0" w:after="0"/>
+            </w:pPr>
+            <w:r/>
+            <w:r>
+              <w:rPr>
+                <w:rFonts w:ascii="Calibri" w:hAnsi="Calibri" w:cs="Calibri" w:eastAsia="Calibri"/>
+                <w:b w:val="0"/>
+                <w:i w:val="0"/>
+                <w:color w:val="1B2836"/>
+                <w:sz w:val="21"/>
+              </w:rPr>
+              <w:t>Documente le port écouté dans le conteneur. La publication vers le Mac se décide au lancement.</w:t>
+            </w:r>
+          </w:p>
+        </w:tc>
+      </w:tr>
+      <w:tr>
+        <w:trPr>
+          <w:cantSplit/>
+        </w:trPr>
+        <w:tc>
+          <w:tcPr>
+            <w:tcW w:type="dxa" w:w="4200"/>
+            <w:tcBorders>
+              <w:top w:val="single" w:sz="4" w:space="0" w:color="D0D7DE"/>
+              <w:left w:val="single" w:sz="4" w:space="0" w:color="D0D7DE"/>
+              <w:bottom w:val="single" w:sz="4" w:space="0" w:color="D0D7DE"/>
+              <w:right w:val="single" w:sz="4" w:space="0" w:color="D0D7DE"/>
+            </w:tcBorders>
+            <w:tcMar>
+              <w:top w:w="60" w:type="dxa"/>
+              <w:left w:w="80" w:type="dxa"/>
+              <w:bottom w:w="60" w:type="dxa"/>
+              <w:right w:w="80" w:type="dxa"/>
+            </w:tcMar>
+          </w:tcPr>
+          <w:p>
+            <w:pPr>
+              <w:spacing w:before="0" w:after="0"/>
+            </w:pPr>
+            <w:r/>
+            <w:r>
+              <w:rPr>
+                <w:rFonts w:ascii="Calibri" w:hAnsi="Calibri" w:cs="Calibri" w:eastAsia="Calibri"/>
+                <w:b/>
+                <w:i w:val="0"/>
+                <w:color w:val="1B2836"/>
+                <w:sz w:val="21"/>
+              </w:rPr>
+              <w:t>HEALTHCHECK</w:t>
+            </w:r>
+          </w:p>
+        </w:tc>
+        <w:tc>
+          <w:tcPr>
+            <w:tcW w:type="dxa" w:w="5400"/>
+            <w:tcBorders>
+              <w:top w:val="single" w:sz="4" w:space="0" w:color="D0D7DE"/>
+              <w:left w:val="single" w:sz="4" w:space="0" w:color="D0D7DE"/>
+              <w:bottom w:val="single" w:sz="4" w:space="0" w:color="D0D7DE"/>
+              <w:right w:val="single" w:sz="4" w:space="0" w:color="D0D7DE"/>
+            </w:tcBorders>
+            <w:tcMar>
+              <w:top w:w="60" w:type="dxa"/>
+              <w:left w:w="80" w:type="dxa"/>
+              <w:bottom w:w="60" w:type="dxa"/>
+              <w:right w:w="80" w:type="dxa"/>
+            </w:tcMar>
+          </w:tcPr>
+          <w:p>
+            <w:pPr>
+              <w:spacing w:before="0" w:after="0"/>
+            </w:pPr>
+            <w:r/>
+            <w:r>
+              <w:rPr>
+                <w:rFonts w:ascii="Calibri" w:hAnsi="Calibri" w:cs="Calibri" w:eastAsia="Calibri"/>
+                <w:b w:val="0"/>
+                <w:i w:val="0"/>
+                <w:color w:val="1B2836"/>
+                <w:sz w:val="21"/>
+              </w:rPr>
+              <w:t>PHP ouvre une socket vers 127.0.0.1:80. Aucun paquet curl n’est ajouté pour ce contrôle.</w:t>
+            </w:r>
+          </w:p>
+        </w:tc>
+      </w:tr>
+    </w:tbl>
+    <w:p/>
+    <w:p>
+      <w:pPr>
+        <w:spacing w:before="0" w:after="160" w:line="259" w:lineRule="auto"/>
+      </w:pPr>
+      <w:r>
+        <w:rPr>
+          <w:rFonts w:ascii="Calibri" w:hAnsi="Calibri" w:cs="Calibri" w:eastAsia="Calibri"/>
+          <w:b w:val="0"/>
+          <w:i w:val="0"/>
+          <w:color w:val="1B2836"/>
+          <w:sz w:val="22"/>
+        </w:rPr>
+        <w:t>Il n’y a pas de compilation d’assets. Un build multi-étapes n’enlèverait aucun outil de construction, parce qu’il n’y en a pas. L’image reste en une seule étape.</w:t>
+      </w:r>
+    </w:p>
+    <w:p>
+      <w:pPr>
+        <w:spacing w:before="0" w:after="160" w:line="259" w:lineRule="auto"/>
+      </w:pPr>
+      <w:r>
+        <w:rPr>
+          <w:rFonts w:ascii="Calibri" w:hAnsi="Calibri" w:cs="Calibri" w:eastAsia="Calibri"/>
+          <w:b w:val="0"/>
+          <w:i w:val="0"/>
+          <w:color w:val="1B2836"/>
+          <w:sz w:val="22"/>
+        </w:rPr>
+        <w:t>L’image a été construite puis lancée. Apache 2.4.69 et PHP 8.2.35 démarrent. getcap confirme cap_net_bind_service sur apache2. La page d’accueil répond en HTTP 200 et le healthcheck passe à healthy. Sans base jointe, le message PDO cite l’hôte db : la configuration ne pointe plus vers localhost. L’image pèse 717 Mo.</w:t>
+      </w:r>
+    </w:p>
+    <w:p>
+      <w:pPr>
+        <w:pStyle w:val="Heading2"/>
+        <w:spacing w:before="240" w:after="120"/>
+      </w:pPr>
+      <w:r>
+        <w:rPr>
+          <w:rFonts w:ascii="Calibri" w:hAnsi="Calibri" w:cs="Calibri" w:eastAsia="Calibri"/>
+          <w:b/>
+          <w:i w:val="0"/>
+          <w:color w:val="1F4E79"/>
+          <w:sz w:val="26"/>
+        </w:rPr>
+        <w:t>2. Service base</w:t>
+      </w:r>
+    </w:p>
+    <w:p>
+      <w:pPr>
+        <w:spacing w:before="0" w:after="160" w:line="259" w:lineRule="auto"/>
+      </w:pPr>
+      <w:r>
+        <w:rPr>
+          <w:rFonts w:ascii="Calibri" w:hAnsi="Calibri" w:cs="Calibri" w:eastAsia="Calibri"/>
+          <w:b w:val="0"/>
+          <w:i w:val="0"/>
+          <w:color w:val="1B2836"/>
+          <w:sz w:val="22"/>
+        </w:rPr>
+        <w:t>docker/mysql/Dockerfile part de mysql:8.4. Il copie articles.sql dans /docker-entrypoint-initdb.d/01-articles.sql. Au premier démarrage, l’entrypoint officiel crée la base et le compte applicatif à partir des variables d’environnement, puis exécute ce script dans la base MYSQL_DATABASE. Le script ne contient plus que le CREATE TABLE de articles.</w:t>
+      </w:r>
+    </w:p>
+    <w:tbl>
+      <w:tblPr>
+        <w:tblW w:type="dxa" w:w="9600"/>
+        <w:tblLayout w:type="fixed"/>
+        <w:tblLook w:firstColumn="1" w:firstRow="1" w:lastColumn="0" w:lastRow="0" w:noHBand="0" w:noVBand="1" w:val="04A0"/>
+      </w:tblPr>
+      <w:tblGrid>
+        <w:gridCol w:w="3200"/>
+        <w:gridCol w:w="6400"/>
+      </w:tblGrid>
+      <w:tr>
+        <w:trPr>
+          <w:cantSplit/>
+        </w:trPr>
+        <w:tc>
+          <w:tcPr>
+            <w:tcW w:type="dxa" w:w="3200"/>
+            <w:shd w:val="clear" w:color="auto" w:fill="1F4E79"/>
+            <w:tcBorders>
+              <w:top w:val="single" w:sz="4" w:space="0" w:color="D0D7DE"/>
+              <w:left w:val="single" w:sz="4" w:space="0" w:color="D0D7DE"/>
+              <w:bottom w:val="single" w:sz="4" w:space="0" w:color="D0D7DE"/>
+              <w:right w:val="single" w:sz="4" w:space="0" w:color="D0D7DE"/>
+            </w:tcBorders>
+            <w:tcMar>
+              <w:top w:w="60" w:type="dxa"/>
+              <w:left w:w="80" w:type="dxa"/>
+              <w:bottom w:w="60" w:type="dxa"/>
+              <w:right w:w="80" w:type="dxa"/>
+            </w:tcMar>
+          </w:tcPr>
+          <w:p>
+            <w:pPr>
+              <w:spacing w:before="0" w:after="0"/>
+            </w:pPr>
+            <w:r/>
+            <w:r>
+              <w:rPr>
+                <w:rFonts w:ascii="Calibri" w:hAnsi="Calibri" w:cs="Calibri" w:eastAsia="Calibri"/>
+                <w:b/>
+                <w:i w:val="0"/>
+                <w:color w:val="FFFFFF"/>
+                <w:sz w:val="21"/>
+              </w:rPr>
+              <w:t>Choix</w:t>
+            </w:r>
+          </w:p>
+        </w:tc>
+        <w:tc>
+          <w:tcPr>
+            <w:tcW w:type="dxa" w:w="6400"/>
+            <w:shd w:val="clear" w:color="auto" w:fill="1F4E79"/>
+            <w:tcBorders>
+              <w:top w:val="single" w:sz="4" w:space="0" w:color="D0D7DE"/>
+              <w:left w:val="single" w:sz="4" w:space="0" w:color="D0D7DE"/>
+              <w:bottom w:val="single" w:sz="4" w:space="0" w:color="D0D7DE"/>
+              <w:right w:val="single" w:sz="4" w:space="0" w:color="D0D7DE"/>
+            </w:tcBorders>
+            <w:tcMar>
+              <w:top w:w="60" w:type="dxa"/>
+              <w:left w:w="80" w:type="dxa"/>
+              <w:bottom w:w="60" w:type="dxa"/>
+              <w:right w:w="80" w:type="dxa"/>
+            </w:tcMar>
+          </w:tcPr>
+          <w:p>
+            <w:pPr>
+              <w:spacing w:before="0" w:after="0"/>
+            </w:pPr>
+            <w:r/>
+            <w:r>
+              <w:rPr>
+                <w:rFonts w:ascii="Calibri" w:hAnsi="Calibri" w:cs="Calibri" w:eastAsia="Calibri"/>
+                <w:b/>
+                <w:i w:val="0"/>
+                <w:color w:val="FFFFFF"/>
+                <w:sz w:val="21"/>
+              </w:rPr>
+              <w:t>Rôle</w:t>
+            </w:r>
+          </w:p>
+        </w:tc>
+      </w:tr>
+      <w:tr>
+        <w:trPr>
+          <w:cantSplit/>
+        </w:trPr>
+        <w:tc>
+          <w:tcPr>
+            <w:tcW w:type="dxa" w:w="3200"/>
+            <w:tcBorders>
+              <w:top w:val="single" w:sz="4" w:space="0" w:color="D0D7DE"/>
+              <w:left w:val="single" w:sz="4" w:space="0" w:color="D0D7DE"/>
+              <w:bottom w:val="single" w:sz="4" w:space="0" w:color="D0D7DE"/>
+              <w:right w:val="single" w:sz="4" w:space="0" w:color="D0D7DE"/>
+            </w:tcBorders>
+            <w:tcMar>
+              <w:top w:w="60" w:type="dxa"/>
+              <w:left w:w="80" w:type="dxa"/>
+              <w:bottom w:w="60" w:type="dxa"/>
+              <w:right w:w="80" w:type="dxa"/>
+            </w:tcMar>
+          </w:tcPr>
+          <w:p>
+            <w:pPr>
+              <w:spacing w:before="0" w:after="0"/>
+            </w:pPr>
+            <w:r/>
+            <w:r>
+              <w:rPr>
+                <w:rFonts w:ascii="Calibri" w:hAnsi="Calibri" w:cs="Calibri" w:eastAsia="Calibri"/>
+                <w:b/>
+                <w:i w:val="0"/>
+                <w:color w:val="1B2836"/>
+                <w:sz w:val="21"/>
+              </w:rPr>
+              <w:t>FROM mysql:8.4</w:t>
+            </w:r>
+          </w:p>
+        </w:tc>
+        <w:tc>
+          <w:tcPr>
+            <w:tcW w:type="dxa" w:w="6400"/>
+            <w:tcBorders>
+              <w:top w:val="single" w:sz="4" w:space="0" w:color="D0D7DE"/>
+              <w:left w:val="single" w:sz="4" w:space="0" w:color="D0D7DE"/>
+              <w:bottom w:val="single" w:sz="4" w:space="0" w:color="D0D7DE"/>
+              <w:right w:val="single" w:sz="4" w:space="0" w:color="D0D7DE"/>
+            </w:tcBorders>
+            <w:tcMar>
+              <w:top w:w="60" w:type="dxa"/>
+              <w:left w:w="80" w:type="dxa"/>
+              <w:bottom w:w="60" w:type="dxa"/>
+              <w:right w:w="80" w:type="dxa"/>
+            </w:tcMar>
+          </w:tcPr>
+          <w:p>
+            <w:pPr>
+              <w:spacing w:before="0" w:after="0"/>
+            </w:pPr>
+            <w:r/>
+            <w:r>
+              <w:rPr>
+                <w:rFonts w:ascii="Calibri" w:hAnsi="Calibri" w:cs="Calibri" w:eastAsia="Calibri"/>
+                <w:b w:val="0"/>
+                <w:i w:val="0"/>
+                <w:color w:val="1B2836"/>
+                <w:sz w:val="21"/>
+              </w:rPr>
+              <w:t>Image officielle. Le tag fixe la branche 8.4.</w:t>
+            </w:r>
+          </w:p>
+        </w:tc>
+      </w:tr>
+      <w:tr>
+        <w:trPr>
+          <w:cantSplit/>
+        </w:trPr>
+        <w:tc>
+          <w:tcPr>
+            <w:tcW w:type="dxa" w:w="3200"/>
+            <w:tcBorders>
+              <w:top w:val="single" w:sz="4" w:space="0" w:color="D0D7DE"/>
+              <w:left w:val="single" w:sz="4" w:space="0" w:color="D0D7DE"/>
+              <w:bottom w:val="single" w:sz="4" w:space="0" w:color="D0D7DE"/>
+              <w:right w:val="single" w:sz="4" w:space="0" w:color="D0D7DE"/>
+            </w:tcBorders>
+            <w:tcMar>
+              <w:top w:w="60" w:type="dxa"/>
+              <w:left w:w="80" w:type="dxa"/>
+              <w:bottom w:w="60" w:type="dxa"/>
+              <w:right w:w="80" w:type="dxa"/>
+            </w:tcMar>
+            <w:shd w:val="clear" w:color="auto" w:fill="F4F7FB"/>
+          </w:tcPr>
+          <w:p>
+            <w:pPr>
+              <w:spacing w:before="0" w:after="0"/>
+            </w:pPr>
+            <w:r/>
+            <w:r>
+              <w:rPr>
+                <w:rFonts w:ascii="Calibri" w:hAnsi="Calibri" w:cs="Calibri" w:eastAsia="Calibri"/>
+                <w:b/>
+                <w:i w:val="0"/>
+                <w:color w:val="1B2836"/>
+                <w:sz w:val="21"/>
+              </w:rPr>
+              <w:t>COPY du script SQL</w:t>
+            </w:r>
+          </w:p>
+        </w:tc>
+        <w:tc>
+          <w:tcPr>
+            <w:tcW w:type="dxa" w:w="6400"/>
+            <w:tcBorders>
+              <w:top w:val="single" w:sz="4" w:space="0" w:color="D0D7DE"/>
+              <w:left w:val="single" w:sz="4" w:space="0" w:color="D0D7DE"/>
+              <w:bottom w:val="single" w:sz="4" w:space="0" w:color="D0D7DE"/>
+              <w:right w:val="single" w:sz="4" w:space="0" w:color="D0D7DE"/>
+            </w:tcBorders>
+            <w:tcMar>
+              <w:top w:w="60" w:type="dxa"/>
+              <w:left w:w="80" w:type="dxa"/>
+              <w:bottom w:w="60" w:type="dxa"/>
+              <w:right w:w="80" w:type="dxa"/>
+            </w:tcMar>
+            <w:shd w:val="clear" w:color="auto" w:fill="F4F7FB"/>
+          </w:tcPr>
+          <w:p>
+            <w:pPr>
+              <w:spacing w:before="0" w:after="0"/>
+            </w:pPr>
+            <w:r/>
+            <w:r>
+              <w:rPr>
+                <w:rFonts w:ascii="Calibri" w:hAnsi="Calibri" w:cs="Calibri" w:eastAsia="Calibri"/>
+                <w:b w:val="0"/>
+                <w:i w:val="0"/>
+                <w:color w:val="1B2836"/>
+                <w:sz w:val="21"/>
+              </w:rPr>
+              <w:t>La table est créée au premier démarrage, seulement si le volume de données est vide.</w:t>
+            </w:r>
+          </w:p>
+        </w:tc>
+      </w:tr>
+      <w:tr>
+        <w:trPr>
+          <w:cantSplit/>
+        </w:trPr>
+        <w:tc>
+          <w:tcPr>
+            <w:tcW w:type="dxa" w:w="3200"/>
+            <w:tcBorders>
+              <w:top w:val="single" w:sz="4" w:space="0" w:color="D0D7DE"/>
+              <w:left w:val="single" w:sz="4" w:space="0" w:color="D0D7DE"/>
+              <w:bottom w:val="single" w:sz="4" w:space="0" w:color="D0D7DE"/>
+              <w:right w:val="single" w:sz="4" w:space="0" w:color="D0D7DE"/>
+            </w:tcBorders>
+            <w:tcMar>
+              <w:top w:w="60" w:type="dxa"/>
+              <w:left w:w="80" w:type="dxa"/>
+              <w:bottom w:w="60" w:type="dxa"/>
+              <w:right w:w="80" w:type="dxa"/>
+            </w:tcMar>
+          </w:tcPr>
+          <w:p>
+            <w:pPr>
+              <w:spacing w:before="0" w:after="0"/>
+            </w:pPr>
+            <w:r/>
+            <w:r>
+              <w:rPr>
+                <w:rFonts w:ascii="Calibri" w:hAnsi="Calibri" w:cs="Calibri" w:eastAsia="Calibri"/>
+                <w:b/>
+                <w:i w:val="0"/>
+                <w:color w:val="1B2836"/>
+                <w:sz w:val="21"/>
+              </w:rPr>
+              <w:t>Pas de variable ENV</w:t>
+            </w:r>
+          </w:p>
+        </w:tc>
+        <w:tc>
+          <w:tcPr>
+            <w:tcW w:type="dxa" w:w="6400"/>
+            <w:tcBorders>
+              <w:top w:val="single" w:sz="4" w:space="0" w:color="D0D7DE"/>
+              <w:left w:val="single" w:sz="4" w:space="0" w:color="D0D7DE"/>
+              <w:bottom w:val="single" w:sz="4" w:space="0" w:color="D0D7DE"/>
+              <w:right w:val="single" w:sz="4" w:space="0" w:color="D0D7DE"/>
+            </w:tcBorders>
+            <w:tcMar>
+              <w:top w:w="60" w:type="dxa"/>
+              <w:left w:w="80" w:type="dxa"/>
+              <w:bottom w:w="60" w:type="dxa"/>
+              <w:right w:w="80" w:type="dxa"/>
+            </w:tcMar>
+          </w:tcPr>
+          <w:p>
+            <w:pPr>
+              <w:spacing w:before="0" w:after="0"/>
+            </w:pPr>
+            <w:r/>
+            <w:r>
+              <w:rPr>
+                <w:rFonts w:ascii="Calibri" w:hAnsi="Calibri" w:cs="Calibri" w:eastAsia="Calibri"/>
+                <w:b w:val="0"/>
+                <w:i w:val="0"/>
+                <w:color w:val="1B2836"/>
+                <w:sz w:val="21"/>
+              </w:rPr>
+              <w:t>Un mot de passe écrit ici resterait lisible dans l’historique de l’image. Au lancement, MYSQL_ROOT_PASSWORD fixe le compte root, MYSQL_DATABASE la base, MYSQL_USER et MYSQL_PASSWORD le compte utilisé par PHP.</w:t>
+            </w:r>
+          </w:p>
+        </w:tc>
+      </w:tr>
+      <w:tr>
+        <w:trPr>
+          <w:cantSplit/>
+        </w:trPr>
+        <w:tc>
+          <w:tcPr>
+            <w:tcW w:type="dxa" w:w="3200"/>
+            <w:tcBorders>
+              <w:top w:val="single" w:sz="4" w:space="0" w:color="D0D7DE"/>
+              <w:left w:val="single" w:sz="4" w:space="0" w:color="D0D7DE"/>
+              <w:bottom w:val="single" w:sz="4" w:space="0" w:color="D0D7DE"/>
+              <w:right w:val="single" w:sz="4" w:space="0" w:color="D0D7DE"/>
+            </w:tcBorders>
+            <w:tcMar>
+              <w:top w:w="60" w:type="dxa"/>
+              <w:left w:w="80" w:type="dxa"/>
+              <w:bottom w:w="60" w:type="dxa"/>
+              <w:right w:w="80" w:type="dxa"/>
+            </w:tcMar>
+            <w:shd w:val="clear" w:color="auto" w:fill="F4F7FB"/>
+          </w:tcPr>
+          <w:p>
+            <w:pPr>
+              <w:spacing w:before="0" w:after="0"/>
+            </w:pPr>
+            <w:r/>
+            <w:r>
+              <w:rPr>
+                <w:rFonts w:ascii="Calibri" w:hAnsi="Calibri" w:cs="Calibri" w:eastAsia="Calibri"/>
+                <w:b/>
+                <w:i w:val="0"/>
+                <w:color w:val="1B2836"/>
+                <w:sz w:val="21"/>
+              </w:rPr>
+              <w:t>Pas d’instruction USER</w:t>
+            </w:r>
+          </w:p>
+        </w:tc>
+        <w:tc>
+          <w:tcPr>
+            <w:tcW w:type="dxa" w:w="6400"/>
+            <w:tcBorders>
+              <w:top w:val="single" w:sz="4" w:space="0" w:color="D0D7DE"/>
+              <w:left w:val="single" w:sz="4" w:space="0" w:color="D0D7DE"/>
+              <w:bottom w:val="single" w:sz="4" w:space="0" w:color="D0D7DE"/>
+              <w:right w:val="single" w:sz="4" w:space="0" w:color="D0D7DE"/>
+            </w:tcBorders>
+            <w:tcMar>
+              <w:top w:w="60" w:type="dxa"/>
+              <w:left w:w="80" w:type="dxa"/>
+              <w:bottom w:w="60" w:type="dxa"/>
+              <w:right w:w="80" w:type="dxa"/>
+            </w:tcMar>
+            <w:shd w:val="clear" w:color="auto" w:fill="F4F7FB"/>
+          </w:tcPr>
+          <w:p>
+            <w:pPr>
+              <w:spacing w:before="0" w:after="0"/>
+            </w:pPr>
+            <w:r/>
+            <w:r>
+              <w:rPr>
+                <w:rFonts w:ascii="Calibri" w:hAnsi="Calibri" w:cs="Calibri" w:eastAsia="Calibri"/>
+                <w:b w:val="0"/>
+                <w:i w:val="0"/>
+                <w:color w:val="1B2836"/>
+                <w:sz w:val="21"/>
+              </w:rPr>
+              <w:t>L’entrypoint prépare les dossiers en root, puis passe à l’utilisateur mysql avec gosu avant de lancer le serveur. Le processus mysqld n’est pas root.</w:t>
+            </w:r>
+          </w:p>
+        </w:tc>
+      </w:tr>
+    </w:tbl>
+    <w:p/>
+    <w:p>
+      <w:pPr>
+        <w:spacing w:before="0" w:after="160" w:line="259" w:lineRule="auto"/>
+      </w:pPr>
+      <w:r>
+        <w:rPr>
+          <w:rFonts w:ascii="Calibri" w:hAnsi="Calibri" w:cs="Calibri" w:eastAsia="Calibri"/>
+          <w:b w:val="0"/>
+          <w:i w:val="0"/>
+          <w:color w:val="1B2836"/>
+          <w:sz w:val="22"/>
+        </w:rPr>
+        <w:t>db-config.php lit DB_HOST, DB_PORT, DB_NAME, DB_USER et DB_PASS. Une variable absente arrête la page avec un message explicite, au lieu de retomber sur localhost. L’image MySQL construite pèse 1,1 Go. Le script SQL y est bien présent.</w:t>
+      </w:r>
+    </w:p>
+    <w:p>
+      <w:pPr>
+        <w:pStyle w:val="Heading2"/>
+        <w:spacing w:before="240" w:after="120"/>
+      </w:pPr>
+      <w:r>
+        <w:rPr>
+          <w:rFonts w:ascii="Calibri" w:hAnsi="Calibri" w:cs="Calibri" w:eastAsia="Calibri"/>
+          <w:b/>
+          <w:i w:val="0"/>
+          <w:color w:val="1F4E79"/>
+          <w:sz w:val="26"/>
+        </w:rPr>
+        <w:t>3. Contexte de build et droits</w:t>
+      </w:r>
+    </w:p>
+    <w:p>
+      <w:pPr>
+        <w:spacing w:before="0" w:after="160" w:line="259" w:lineRule="auto"/>
+      </w:pPr>
+      <w:r>
+        <w:rPr>
+          <w:rFonts w:ascii="Calibri" w:hAnsi="Calibri" w:cs="Calibri" w:eastAsia="Calibri"/>
+          <w:b w:val="0"/>
+          <w:i w:val="0"/>
+          <w:color w:val="1B2836"/>
+          <w:sz w:val="22"/>
+        </w:rPr>
+        <w:t>.dockerignore exclut .git, .env, les rapports, la documentation et l’archive du sujet. Ces fichiers n’entrent pas dans le contexte envoyé au démon, et un COPY trop large ne peut pas les embarquer dans une couche.</w:t>
+      </w:r>
+    </w:p>
+    <w:p>
+      <w:pPr>
+        <w:spacing w:before="0" w:after="160" w:line="259" w:lineRule="auto"/>
+      </w:pPr>
+      <w:r>
+        <w:rPr>
+          <w:rFonts w:ascii="Calibri" w:hAnsi="Calibri" w:cs="Calibri" w:eastAsia="Calibri"/>
+          <w:b w:val="0"/>
+          <w:i w:val="0"/>
+          <w:color w:val="1B2836"/>
+          <w:sz w:val="22"/>
+        </w:rPr>
+        <w:t>Aucun chmod 777 n’est utilisé. Ce mode rend le fichier lisible et modifiable par tout utilisateur du conteneur et, selon le montage, de l’hôte. Un processus qui peut écrire dans /var/www/html peut remplacer index.php. L’application n’enregistre pas de fichier : Apache a besoin de lire le code, pas de le modifier. Les fichiers restent ceux copiés, appartenant à www-data.</w:t>
+      </w:r>
+    </w:p>
     <w:sectPr>
       <w:headerReference w:type="default" r:id="rId9"/>
       <w:footerReference w:type="default" r:id="rId10"/>

</xml_diff>

<commit_message>
partie 3 : orchestrer la pile avec compose
</commit_message>
<xml_diff>
--- a/Rapport-LAUMOND_COURCHAY.docx
+++ b/Rapport-LAUMOND_COURCHAY.docx
@@ -4267,6 +4267,1263 @@
         <w:t>Aucun chmod 777 n’est utilisé. Ce mode rend le fichier lisible et modifiable par tout utilisateur du conteneur et, selon le montage, de l’hôte. Un processus qui peut écrire dans /var/www/html peut remplacer index.php. L’application n’enregistre pas de fichier : Apache a besoin de lire le code, pas de le modifier. Les fichiers restent ceux copiés, appartenant à www-data.</w:t>
       </w:r>
     </w:p>
+    <w:p>
+      <w:pPr>
+        <w:pStyle w:val="Heading1"/>
+        <w:spacing w:before="280" w:after="120"/>
+      </w:pPr>
+      <w:r>
+        <w:rPr>
+          <w:rFonts w:ascii="Calibri" w:hAnsi="Calibri" w:cs="Calibri" w:eastAsia="Calibri"/>
+          <w:b/>
+          <w:i w:val="0"/>
+          <w:color w:val="1F4E79"/>
+          <w:sz w:val="32"/>
+        </w:rPr>
+        <w:t>Partie 3 — Orchestration</w:t>
+      </w:r>
+    </w:p>
+    <w:p>
+      <w:pPr>
+        <w:spacing w:before="0" w:after="160" w:line="259" w:lineRule="auto"/>
+      </w:pPr>
+      <w:r>
+        <w:rPr>
+          <w:rFonts w:ascii="Calibri" w:hAnsi="Calibri" w:cs="Calibri" w:eastAsia="Calibri"/>
+          <w:b w:val="0"/>
+          <w:i w:val="0"/>
+          <w:color w:val="1B2836"/>
+          <w:sz w:val="22"/>
+        </w:rPr>
+        <w:t>docker-compose.yml lance les trois services du projet articles. Les mots de passe ne sont pas écrits dans ce fichier : Compose les lit dans .env, qui n’est pas versionné. .env.example en est le modèle.</w:t>
+      </w:r>
+    </w:p>
+    <w:p>
+      <w:pPr>
+        <w:pStyle w:val="Heading2"/>
+        <w:spacing w:before="240" w:after="120"/>
+      </w:pPr>
+      <w:r>
+        <w:rPr>
+          <w:rFonts w:ascii="Calibri" w:hAnsi="Calibri" w:cs="Calibri" w:eastAsia="Calibri"/>
+          <w:b/>
+          <w:i w:val="0"/>
+          <w:color w:val="1F4E79"/>
+          <w:sz w:val="26"/>
+        </w:rPr>
+        <w:t>1. Sections du fichier</w:t>
+      </w:r>
+    </w:p>
+    <w:tbl>
+      <w:tblPr>
+        <w:tblW w:type="dxa" w:w="9600"/>
+        <w:tblLayout w:type="fixed"/>
+        <w:tblLook w:firstColumn="1" w:firstRow="1" w:lastColumn="0" w:lastRow="0" w:noHBand="0" w:noVBand="1" w:val="04A0"/>
+      </w:tblPr>
+      <w:tblGrid>
+        <w:gridCol w:w="2800"/>
+        <w:gridCol w:w="6800"/>
+      </w:tblGrid>
+      <w:tr>
+        <w:trPr>
+          <w:cantSplit/>
+        </w:trPr>
+        <w:tc>
+          <w:tcPr>
+            <w:tcW w:type="dxa" w:w="2800"/>
+            <w:shd w:val="clear" w:color="auto" w:fill="1F4E79"/>
+            <w:tcBorders>
+              <w:top w:val="single" w:sz="4" w:space="0" w:color="D0D7DE"/>
+              <w:left w:val="single" w:sz="4" w:space="0" w:color="D0D7DE"/>
+              <w:bottom w:val="single" w:sz="4" w:space="0" w:color="D0D7DE"/>
+              <w:right w:val="single" w:sz="4" w:space="0" w:color="D0D7DE"/>
+            </w:tcBorders>
+            <w:tcMar>
+              <w:top w:w="60" w:type="dxa"/>
+              <w:left w:w="80" w:type="dxa"/>
+              <w:bottom w:w="60" w:type="dxa"/>
+              <w:right w:w="80" w:type="dxa"/>
+            </w:tcMar>
+          </w:tcPr>
+          <w:p>
+            <w:pPr>
+              <w:spacing w:before="0" w:after="0"/>
+            </w:pPr>
+            <w:r/>
+            <w:r>
+              <w:rPr>
+                <w:rFonts w:ascii="Calibri" w:hAnsi="Calibri" w:cs="Calibri" w:eastAsia="Calibri"/>
+                <w:b/>
+                <w:i w:val="0"/>
+                <w:color w:val="FFFFFF"/>
+                <w:sz w:val="21"/>
+              </w:rPr>
+              <w:t>Section</w:t>
+            </w:r>
+          </w:p>
+        </w:tc>
+        <w:tc>
+          <w:tcPr>
+            <w:tcW w:type="dxa" w:w="6800"/>
+            <w:shd w:val="clear" w:color="auto" w:fill="1F4E79"/>
+            <w:tcBorders>
+              <w:top w:val="single" w:sz="4" w:space="0" w:color="D0D7DE"/>
+              <w:left w:val="single" w:sz="4" w:space="0" w:color="D0D7DE"/>
+              <w:bottom w:val="single" w:sz="4" w:space="0" w:color="D0D7DE"/>
+              <w:right w:val="single" w:sz="4" w:space="0" w:color="D0D7DE"/>
+            </w:tcBorders>
+            <w:tcMar>
+              <w:top w:w="60" w:type="dxa"/>
+              <w:left w:w="80" w:type="dxa"/>
+              <w:bottom w:w="60" w:type="dxa"/>
+              <w:right w:w="80" w:type="dxa"/>
+            </w:tcMar>
+          </w:tcPr>
+          <w:p>
+            <w:pPr>
+              <w:spacing w:before="0" w:after="0"/>
+            </w:pPr>
+            <w:r/>
+            <w:r>
+              <w:rPr>
+                <w:rFonts w:ascii="Calibri" w:hAnsi="Calibri" w:cs="Calibri" w:eastAsia="Calibri"/>
+                <w:b/>
+                <w:i w:val="0"/>
+                <w:color w:val="FFFFFF"/>
+                <w:sz w:val="21"/>
+              </w:rPr>
+              <w:t>Rôle</w:t>
+            </w:r>
+          </w:p>
+        </w:tc>
+      </w:tr>
+      <w:tr>
+        <w:trPr>
+          <w:cantSplit/>
+        </w:trPr>
+        <w:tc>
+          <w:tcPr>
+            <w:tcW w:type="dxa" w:w="2800"/>
+            <w:tcBorders>
+              <w:top w:val="single" w:sz="4" w:space="0" w:color="D0D7DE"/>
+              <w:left w:val="single" w:sz="4" w:space="0" w:color="D0D7DE"/>
+              <w:bottom w:val="single" w:sz="4" w:space="0" w:color="D0D7DE"/>
+              <w:right w:val="single" w:sz="4" w:space="0" w:color="D0D7DE"/>
+            </w:tcBorders>
+            <w:tcMar>
+              <w:top w:w="60" w:type="dxa"/>
+              <w:left w:w="80" w:type="dxa"/>
+              <w:bottom w:w="60" w:type="dxa"/>
+              <w:right w:w="80" w:type="dxa"/>
+            </w:tcMar>
+          </w:tcPr>
+          <w:p>
+            <w:pPr>
+              <w:spacing w:before="0" w:after="0"/>
+            </w:pPr>
+            <w:r/>
+            <w:r>
+              <w:rPr>
+                <w:rFonts w:ascii="Calibri" w:hAnsi="Calibri" w:cs="Calibri" w:eastAsia="Calibri"/>
+                <w:b/>
+                <w:i w:val="0"/>
+                <w:color w:val="1B2836"/>
+                <w:sz w:val="21"/>
+              </w:rPr>
+              <w:t>name</w:t>
+            </w:r>
+          </w:p>
+        </w:tc>
+        <w:tc>
+          <w:tcPr>
+            <w:tcW w:type="dxa" w:w="6800"/>
+            <w:tcBorders>
+              <w:top w:val="single" w:sz="4" w:space="0" w:color="D0D7DE"/>
+              <w:left w:val="single" w:sz="4" w:space="0" w:color="D0D7DE"/>
+              <w:bottom w:val="single" w:sz="4" w:space="0" w:color="D0D7DE"/>
+              <w:right w:val="single" w:sz="4" w:space="0" w:color="D0D7DE"/>
+            </w:tcBorders>
+            <w:tcMar>
+              <w:top w:w="60" w:type="dxa"/>
+              <w:left w:w="80" w:type="dxa"/>
+              <w:bottom w:w="60" w:type="dxa"/>
+              <w:right w:w="80" w:type="dxa"/>
+            </w:tcMar>
+          </w:tcPr>
+          <w:p>
+            <w:pPr>
+              <w:spacing w:before="0" w:after="0"/>
+            </w:pPr>
+            <w:r/>
+            <w:r>
+              <w:rPr>
+                <w:rFonts w:ascii="Calibri" w:hAnsi="Calibri" w:cs="Calibri" w:eastAsia="Calibri"/>
+                <w:b w:val="0"/>
+                <w:i w:val="0"/>
+                <w:color w:val="1B2836"/>
+                <w:sz w:val="21"/>
+              </w:rPr>
+              <w:t>Nomme le projet articles. Les conteneurs s’appellent web, db et adminer.</w:t>
+            </w:r>
+          </w:p>
+        </w:tc>
+      </w:tr>
+      <w:tr>
+        <w:trPr>
+          <w:cantSplit/>
+        </w:trPr>
+        <w:tc>
+          <w:tcPr>
+            <w:tcW w:type="dxa" w:w="2800"/>
+            <w:tcBorders>
+              <w:top w:val="single" w:sz="4" w:space="0" w:color="D0D7DE"/>
+              <w:left w:val="single" w:sz="4" w:space="0" w:color="D0D7DE"/>
+              <w:bottom w:val="single" w:sz="4" w:space="0" w:color="D0D7DE"/>
+              <w:right w:val="single" w:sz="4" w:space="0" w:color="D0D7DE"/>
+            </w:tcBorders>
+            <w:tcMar>
+              <w:top w:w="60" w:type="dxa"/>
+              <w:left w:w="80" w:type="dxa"/>
+              <w:bottom w:w="60" w:type="dxa"/>
+              <w:right w:w="80" w:type="dxa"/>
+            </w:tcMar>
+            <w:shd w:val="clear" w:color="auto" w:fill="F4F7FB"/>
+          </w:tcPr>
+          <w:p>
+            <w:pPr>
+              <w:spacing w:before="0" w:after="0"/>
+            </w:pPr>
+            <w:r/>
+            <w:r>
+              <w:rPr>
+                <w:rFonts w:ascii="Calibri" w:hAnsi="Calibri" w:cs="Calibri" w:eastAsia="Calibri"/>
+                <w:b/>
+                <w:i w:val="0"/>
+                <w:color w:val="1B2836"/>
+                <w:sz w:val="21"/>
+              </w:rPr>
+              <w:t>web.build</w:t>
+            </w:r>
+          </w:p>
+        </w:tc>
+        <w:tc>
+          <w:tcPr>
+            <w:tcW w:type="dxa" w:w="6800"/>
+            <w:tcBorders>
+              <w:top w:val="single" w:sz="4" w:space="0" w:color="D0D7DE"/>
+              <w:left w:val="single" w:sz="4" w:space="0" w:color="D0D7DE"/>
+              <w:bottom w:val="single" w:sz="4" w:space="0" w:color="D0D7DE"/>
+              <w:right w:val="single" w:sz="4" w:space="0" w:color="D0D7DE"/>
+            </w:tcBorders>
+            <w:tcMar>
+              <w:top w:w="60" w:type="dxa"/>
+              <w:left w:w="80" w:type="dxa"/>
+              <w:bottom w:w="60" w:type="dxa"/>
+              <w:right w:w="80" w:type="dxa"/>
+            </w:tcMar>
+            <w:shd w:val="clear" w:color="auto" w:fill="F4F7FB"/>
+          </w:tcPr>
+          <w:p>
+            <w:pPr>
+              <w:spacing w:before="0" w:after="0"/>
+            </w:pPr>
+            <w:r/>
+            <w:r>
+              <w:rPr>
+                <w:rFonts w:ascii="Calibri" w:hAnsi="Calibri" w:cs="Calibri" w:eastAsia="Calibri"/>
+                <w:b w:val="0"/>
+                <w:i w:val="0"/>
+                <w:color w:val="1B2836"/>
+                <w:sz w:val="21"/>
+              </w:rPr>
+              <w:t>Construit le Dockerfile à la racine. L’image produite s’appelle articles-web:dev.</w:t>
+            </w:r>
+          </w:p>
+        </w:tc>
+      </w:tr>
+      <w:tr>
+        <w:trPr>
+          <w:cantSplit/>
+        </w:trPr>
+        <w:tc>
+          <w:tcPr>
+            <w:tcW w:type="dxa" w:w="2800"/>
+            <w:tcBorders>
+              <w:top w:val="single" w:sz="4" w:space="0" w:color="D0D7DE"/>
+              <w:left w:val="single" w:sz="4" w:space="0" w:color="D0D7DE"/>
+              <w:bottom w:val="single" w:sz="4" w:space="0" w:color="D0D7DE"/>
+              <w:right w:val="single" w:sz="4" w:space="0" w:color="D0D7DE"/>
+            </w:tcBorders>
+            <w:tcMar>
+              <w:top w:w="60" w:type="dxa"/>
+              <w:left w:w="80" w:type="dxa"/>
+              <w:bottom w:w="60" w:type="dxa"/>
+              <w:right w:w="80" w:type="dxa"/>
+            </w:tcMar>
+          </w:tcPr>
+          <w:p>
+            <w:pPr>
+              <w:spacing w:before="0" w:after="0"/>
+            </w:pPr>
+            <w:r/>
+            <w:r>
+              <w:rPr>
+                <w:rFonts w:ascii="Calibri" w:hAnsi="Calibri" w:cs="Calibri" w:eastAsia="Calibri"/>
+                <w:b/>
+                <w:i w:val="0"/>
+                <w:color w:val="1B2836"/>
+                <w:sz w:val="21"/>
+              </w:rPr>
+              <w:t>web.ports</w:t>
+            </w:r>
+          </w:p>
+        </w:tc>
+        <w:tc>
+          <w:tcPr>
+            <w:tcW w:type="dxa" w:w="6800"/>
+            <w:tcBorders>
+              <w:top w:val="single" w:sz="4" w:space="0" w:color="D0D7DE"/>
+              <w:left w:val="single" w:sz="4" w:space="0" w:color="D0D7DE"/>
+              <w:bottom w:val="single" w:sz="4" w:space="0" w:color="D0D7DE"/>
+              <w:right w:val="single" w:sz="4" w:space="0" w:color="D0D7DE"/>
+            </w:tcBorders>
+            <w:tcMar>
+              <w:top w:w="60" w:type="dxa"/>
+              <w:left w:w="80" w:type="dxa"/>
+              <w:bottom w:w="60" w:type="dxa"/>
+              <w:right w:w="80" w:type="dxa"/>
+            </w:tcMar>
+          </w:tcPr>
+          <w:p>
+            <w:pPr>
+              <w:spacing w:before="0" w:after="0"/>
+            </w:pPr>
+            <w:r/>
+            <w:r>
+              <w:rPr>
+                <w:rFonts w:ascii="Calibri" w:hAnsi="Calibri" w:cs="Calibri" w:eastAsia="Calibri"/>
+                <w:b w:val="0"/>
+                <w:i w:val="0"/>
+                <w:color w:val="1B2836"/>
+                <w:sz w:val="21"/>
+              </w:rPr>
+              <w:t>Publie le port 80 du conteneur sur 127.0.0.1 et le port APP_PORT, 8080 par défaut. Les autres interfaces du Mac ne reçoivent pas ce port.</w:t>
+            </w:r>
+          </w:p>
+        </w:tc>
+      </w:tr>
+      <w:tr>
+        <w:trPr>
+          <w:cantSplit/>
+        </w:trPr>
+        <w:tc>
+          <w:tcPr>
+            <w:tcW w:type="dxa" w:w="2800"/>
+            <w:tcBorders>
+              <w:top w:val="single" w:sz="4" w:space="0" w:color="D0D7DE"/>
+              <w:left w:val="single" w:sz="4" w:space="0" w:color="D0D7DE"/>
+              <w:bottom w:val="single" w:sz="4" w:space="0" w:color="D0D7DE"/>
+              <w:right w:val="single" w:sz="4" w:space="0" w:color="D0D7DE"/>
+            </w:tcBorders>
+            <w:tcMar>
+              <w:top w:w="60" w:type="dxa"/>
+              <w:left w:w="80" w:type="dxa"/>
+              <w:bottom w:w="60" w:type="dxa"/>
+              <w:right w:w="80" w:type="dxa"/>
+            </w:tcMar>
+            <w:shd w:val="clear" w:color="auto" w:fill="F4F7FB"/>
+          </w:tcPr>
+          <w:p>
+            <w:pPr>
+              <w:spacing w:before="0" w:after="0"/>
+            </w:pPr>
+            <w:r/>
+            <w:r>
+              <w:rPr>
+                <w:rFonts w:ascii="Calibri" w:hAnsi="Calibri" w:cs="Calibri" w:eastAsia="Calibri"/>
+                <w:b/>
+                <w:i w:val="0"/>
+                <w:color w:val="1B2836"/>
+                <w:sz w:val="21"/>
+              </w:rPr>
+              <w:t>web.environment</w:t>
+            </w:r>
+          </w:p>
+        </w:tc>
+        <w:tc>
+          <w:tcPr>
+            <w:tcW w:type="dxa" w:w="6800"/>
+            <w:tcBorders>
+              <w:top w:val="single" w:sz="4" w:space="0" w:color="D0D7DE"/>
+              <w:left w:val="single" w:sz="4" w:space="0" w:color="D0D7DE"/>
+              <w:bottom w:val="single" w:sz="4" w:space="0" w:color="D0D7DE"/>
+              <w:right w:val="single" w:sz="4" w:space="0" w:color="D0D7DE"/>
+            </w:tcBorders>
+            <w:tcMar>
+              <w:top w:w="60" w:type="dxa"/>
+              <w:left w:w="80" w:type="dxa"/>
+              <w:bottom w:w="60" w:type="dxa"/>
+              <w:right w:w="80" w:type="dxa"/>
+            </w:tcMar>
+            <w:shd w:val="clear" w:color="auto" w:fill="F4F7FB"/>
+          </w:tcPr>
+          <w:p>
+            <w:pPr>
+              <w:spacing w:before="0" w:after="0"/>
+            </w:pPr>
+            <w:r/>
+            <w:r>
+              <w:rPr>
+                <w:rFonts w:ascii="Calibri" w:hAnsi="Calibri" w:cs="Calibri" w:eastAsia="Calibri"/>
+                <w:b w:val="0"/>
+                <w:i w:val="0"/>
+                <w:color w:val="1B2836"/>
+                <w:sz w:val="21"/>
+              </w:rPr>
+              <w:t>Fournit DB_HOST, DB_PORT, DB_NAME, DB_USER et DB_PASS. DB_PASS est obligatoire : le lancement s’arrête si .env ne la définit pas.</w:t>
+            </w:r>
+          </w:p>
+        </w:tc>
+      </w:tr>
+      <w:tr>
+        <w:trPr>
+          <w:cantSplit/>
+        </w:trPr>
+        <w:tc>
+          <w:tcPr>
+            <w:tcW w:type="dxa" w:w="2800"/>
+            <w:tcBorders>
+              <w:top w:val="single" w:sz="4" w:space="0" w:color="D0D7DE"/>
+              <w:left w:val="single" w:sz="4" w:space="0" w:color="D0D7DE"/>
+              <w:bottom w:val="single" w:sz="4" w:space="0" w:color="D0D7DE"/>
+              <w:right w:val="single" w:sz="4" w:space="0" w:color="D0D7DE"/>
+            </w:tcBorders>
+            <w:tcMar>
+              <w:top w:w="60" w:type="dxa"/>
+              <w:left w:w="80" w:type="dxa"/>
+              <w:bottom w:w="60" w:type="dxa"/>
+              <w:right w:w="80" w:type="dxa"/>
+            </w:tcMar>
+          </w:tcPr>
+          <w:p>
+            <w:pPr>
+              <w:spacing w:before="0" w:after="0"/>
+            </w:pPr>
+            <w:r/>
+            <w:r>
+              <w:rPr>
+                <w:rFonts w:ascii="Calibri" w:hAnsi="Calibri" w:cs="Calibri" w:eastAsia="Calibri"/>
+                <w:b/>
+                <w:i w:val="0"/>
+                <w:color w:val="1B2836"/>
+                <w:sz w:val="21"/>
+              </w:rPr>
+              <w:t>web.depends_on</w:t>
+            </w:r>
+          </w:p>
+        </w:tc>
+        <w:tc>
+          <w:tcPr>
+            <w:tcW w:type="dxa" w:w="6800"/>
+            <w:tcBorders>
+              <w:top w:val="single" w:sz="4" w:space="0" w:color="D0D7DE"/>
+              <w:left w:val="single" w:sz="4" w:space="0" w:color="D0D7DE"/>
+              <w:bottom w:val="single" w:sz="4" w:space="0" w:color="D0D7DE"/>
+              <w:right w:val="single" w:sz="4" w:space="0" w:color="D0D7DE"/>
+            </w:tcBorders>
+            <w:tcMar>
+              <w:top w:w="60" w:type="dxa"/>
+              <w:left w:w="80" w:type="dxa"/>
+              <w:bottom w:w="60" w:type="dxa"/>
+              <w:right w:w="80" w:type="dxa"/>
+            </w:tcMar>
+          </w:tcPr>
+          <w:p>
+            <w:pPr>
+              <w:spacing w:before="0" w:after="0"/>
+            </w:pPr>
+            <w:r/>
+            <w:r>
+              <w:rPr>
+                <w:rFonts w:ascii="Calibri" w:hAnsi="Calibri" w:cs="Calibri" w:eastAsia="Calibri"/>
+                <w:b w:val="0"/>
+                <w:i w:val="0"/>
+                <w:color w:val="1B2836"/>
+                <w:sz w:val="21"/>
+              </w:rPr>
+              <w:t>Démarre web une fois db healthy. Un conteneur MySQL démarré n’est pas encore prêt à accepter une connexion.</w:t>
+            </w:r>
+          </w:p>
+        </w:tc>
+      </w:tr>
+      <w:tr>
+        <w:trPr>
+          <w:cantSplit/>
+        </w:trPr>
+        <w:tc>
+          <w:tcPr>
+            <w:tcW w:type="dxa" w:w="2800"/>
+            <w:tcBorders>
+              <w:top w:val="single" w:sz="4" w:space="0" w:color="D0D7DE"/>
+              <w:left w:val="single" w:sz="4" w:space="0" w:color="D0D7DE"/>
+              <w:bottom w:val="single" w:sz="4" w:space="0" w:color="D0D7DE"/>
+              <w:right w:val="single" w:sz="4" w:space="0" w:color="D0D7DE"/>
+            </w:tcBorders>
+            <w:tcMar>
+              <w:top w:w="60" w:type="dxa"/>
+              <w:left w:w="80" w:type="dxa"/>
+              <w:bottom w:w="60" w:type="dxa"/>
+              <w:right w:w="80" w:type="dxa"/>
+            </w:tcMar>
+            <w:shd w:val="clear" w:color="auto" w:fill="F4F7FB"/>
+          </w:tcPr>
+          <w:p>
+            <w:pPr>
+              <w:spacing w:before="0" w:after="0"/>
+            </w:pPr>
+            <w:r/>
+            <w:r>
+              <w:rPr>
+                <w:rFonts w:ascii="Calibri" w:hAnsi="Calibri" w:cs="Calibri" w:eastAsia="Calibri"/>
+                <w:b/>
+                <w:i w:val="0"/>
+                <w:color w:val="1B2836"/>
+                <w:sz w:val="21"/>
+              </w:rPr>
+              <w:t>web.healthcheck</w:t>
+            </w:r>
+          </w:p>
+        </w:tc>
+        <w:tc>
+          <w:tcPr>
+            <w:tcW w:type="dxa" w:w="6800"/>
+            <w:tcBorders>
+              <w:top w:val="single" w:sz="4" w:space="0" w:color="D0D7DE"/>
+              <w:left w:val="single" w:sz="4" w:space="0" w:color="D0D7DE"/>
+              <w:bottom w:val="single" w:sz="4" w:space="0" w:color="D0D7DE"/>
+              <w:right w:val="single" w:sz="4" w:space="0" w:color="D0D7DE"/>
+            </w:tcBorders>
+            <w:tcMar>
+              <w:top w:w="60" w:type="dxa"/>
+              <w:left w:w="80" w:type="dxa"/>
+              <w:bottom w:w="60" w:type="dxa"/>
+              <w:right w:w="80" w:type="dxa"/>
+            </w:tcMar>
+            <w:shd w:val="clear" w:color="auto" w:fill="F4F7FB"/>
+          </w:tcPr>
+          <w:p>
+            <w:pPr>
+              <w:spacing w:before="0" w:after="0"/>
+            </w:pPr>
+            <w:r/>
+            <w:r>
+              <w:rPr>
+                <w:rFonts w:ascii="Calibri" w:hAnsi="Calibri" w:cs="Calibri" w:eastAsia="Calibri"/>
+                <w:b w:val="0"/>
+                <w:i w:val="0"/>
+                <w:color w:val="1B2836"/>
+                <w:sz w:val="21"/>
+              </w:rPr>
+              <w:t>PHP ouvre une socket vers 127.0.0.1:80, comme dans le Dockerfile.</w:t>
+            </w:r>
+          </w:p>
+        </w:tc>
+      </w:tr>
+      <w:tr>
+        <w:trPr>
+          <w:cantSplit/>
+        </w:trPr>
+        <w:tc>
+          <w:tcPr>
+            <w:tcW w:type="dxa" w:w="2800"/>
+            <w:tcBorders>
+              <w:top w:val="single" w:sz="4" w:space="0" w:color="D0D7DE"/>
+              <w:left w:val="single" w:sz="4" w:space="0" w:color="D0D7DE"/>
+              <w:bottom w:val="single" w:sz="4" w:space="0" w:color="D0D7DE"/>
+              <w:right w:val="single" w:sz="4" w:space="0" w:color="D0D7DE"/>
+            </w:tcBorders>
+            <w:tcMar>
+              <w:top w:w="60" w:type="dxa"/>
+              <w:left w:w="80" w:type="dxa"/>
+              <w:bottom w:w="60" w:type="dxa"/>
+              <w:right w:w="80" w:type="dxa"/>
+            </w:tcMar>
+          </w:tcPr>
+          <w:p>
+            <w:pPr>
+              <w:spacing w:before="0" w:after="0"/>
+            </w:pPr>
+            <w:r/>
+            <w:r>
+              <w:rPr>
+                <w:rFonts w:ascii="Calibri" w:hAnsi="Calibri" w:cs="Calibri" w:eastAsia="Calibri"/>
+                <w:b/>
+                <w:i w:val="0"/>
+                <w:color w:val="1B2836"/>
+                <w:sz w:val="21"/>
+              </w:rPr>
+              <w:t>web.restart</w:t>
+            </w:r>
+          </w:p>
+        </w:tc>
+        <w:tc>
+          <w:tcPr>
+            <w:tcW w:type="dxa" w:w="6800"/>
+            <w:tcBorders>
+              <w:top w:val="single" w:sz="4" w:space="0" w:color="D0D7DE"/>
+              <w:left w:val="single" w:sz="4" w:space="0" w:color="D0D7DE"/>
+              <w:bottom w:val="single" w:sz="4" w:space="0" w:color="D0D7DE"/>
+              <w:right w:val="single" w:sz="4" w:space="0" w:color="D0D7DE"/>
+            </w:tcBorders>
+            <w:tcMar>
+              <w:top w:w="60" w:type="dxa"/>
+              <w:left w:w="80" w:type="dxa"/>
+              <w:bottom w:w="60" w:type="dxa"/>
+              <w:right w:w="80" w:type="dxa"/>
+            </w:tcMar>
+          </w:tcPr>
+          <w:p>
+            <w:pPr>
+              <w:spacing w:before="0" w:after="0"/>
+            </w:pPr>
+            <w:r/>
+            <w:r>
+              <w:rPr>
+                <w:rFonts w:ascii="Calibri" w:hAnsi="Calibri" w:cs="Calibri" w:eastAsia="Calibri"/>
+                <w:b w:val="0"/>
+                <w:i w:val="0"/>
+                <w:color w:val="1B2836"/>
+                <w:sz w:val="21"/>
+              </w:rPr>
+              <w:t>unless-stopped relance le conteneur s’il s’arrête, sauf arrêt demandé.</w:t>
+            </w:r>
+          </w:p>
+        </w:tc>
+      </w:tr>
+      <w:tr>
+        <w:trPr>
+          <w:cantSplit/>
+        </w:trPr>
+        <w:tc>
+          <w:tcPr>
+            <w:tcW w:type="dxa" w:w="2800"/>
+            <w:tcBorders>
+              <w:top w:val="single" w:sz="4" w:space="0" w:color="D0D7DE"/>
+              <w:left w:val="single" w:sz="4" w:space="0" w:color="D0D7DE"/>
+              <w:bottom w:val="single" w:sz="4" w:space="0" w:color="D0D7DE"/>
+              <w:right w:val="single" w:sz="4" w:space="0" w:color="D0D7DE"/>
+            </w:tcBorders>
+            <w:tcMar>
+              <w:top w:w="60" w:type="dxa"/>
+              <w:left w:w="80" w:type="dxa"/>
+              <w:bottom w:w="60" w:type="dxa"/>
+              <w:right w:w="80" w:type="dxa"/>
+            </w:tcMar>
+            <w:shd w:val="clear" w:color="auto" w:fill="F4F7FB"/>
+          </w:tcPr>
+          <w:p>
+            <w:pPr>
+              <w:spacing w:before="0" w:after="0"/>
+            </w:pPr>
+            <w:r/>
+            <w:r>
+              <w:rPr>
+                <w:rFonts w:ascii="Calibri" w:hAnsi="Calibri" w:cs="Calibri" w:eastAsia="Calibri"/>
+                <w:b/>
+                <w:i w:val="0"/>
+                <w:color w:val="1B2836"/>
+                <w:sz w:val="21"/>
+              </w:rPr>
+              <w:t>db.build</w:t>
+            </w:r>
+          </w:p>
+        </w:tc>
+        <w:tc>
+          <w:tcPr>
+            <w:tcW w:type="dxa" w:w="6800"/>
+            <w:tcBorders>
+              <w:top w:val="single" w:sz="4" w:space="0" w:color="D0D7DE"/>
+              <w:left w:val="single" w:sz="4" w:space="0" w:color="D0D7DE"/>
+              <w:bottom w:val="single" w:sz="4" w:space="0" w:color="D0D7DE"/>
+              <w:right w:val="single" w:sz="4" w:space="0" w:color="D0D7DE"/>
+            </w:tcBorders>
+            <w:tcMar>
+              <w:top w:w="60" w:type="dxa"/>
+              <w:left w:w="80" w:type="dxa"/>
+              <w:bottom w:w="60" w:type="dxa"/>
+              <w:right w:w="80" w:type="dxa"/>
+            </w:tcMar>
+            <w:shd w:val="clear" w:color="auto" w:fill="F4F7FB"/>
+          </w:tcPr>
+          <w:p>
+            <w:pPr>
+              <w:spacing w:before="0" w:after="0"/>
+            </w:pPr>
+            <w:r/>
+            <w:r>
+              <w:rPr>
+                <w:rFonts w:ascii="Calibri" w:hAnsi="Calibri" w:cs="Calibri" w:eastAsia="Calibri"/>
+                <w:b w:val="0"/>
+                <w:i w:val="0"/>
+                <w:color w:val="1B2836"/>
+                <w:sz w:val="21"/>
+              </w:rPr>
+              <w:t>Construit docker/mysql/Dockerfile. L’image produite s’appelle articles-db:dev.</w:t>
+            </w:r>
+          </w:p>
+        </w:tc>
+      </w:tr>
+      <w:tr>
+        <w:trPr>
+          <w:cantSplit/>
+        </w:trPr>
+        <w:tc>
+          <w:tcPr>
+            <w:tcW w:type="dxa" w:w="2800"/>
+            <w:tcBorders>
+              <w:top w:val="single" w:sz="4" w:space="0" w:color="D0D7DE"/>
+              <w:left w:val="single" w:sz="4" w:space="0" w:color="D0D7DE"/>
+              <w:bottom w:val="single" w:sz="4" w:space="0" w:color="D0D7DE"/>
+              <w:right w:val="single" w:sz="4" w:space="0" w:color="D0D7DE"/>
+            </w:tcBorders>
+            <w:tcMar>
+              <w:top w:w="60" w:type="dxa"/>
+              <w:left w:w="80" w:type="dxa"/>
+              <w:bottom w:w="60" w:type="dxa"/>
+              <w:right w:w="80" w:type="dxa"/>
+            </w:tcMar>
+          </w:tcPr>
+          <w:p>
+            <w:pPr>
+              <w:spacing w:before="0" w:after="0"/>
+            </w:pPr>
+            <w:r/>
+            <w:r>
+              <w:rPr>
+                <w:rFonts w:ascii="Calibri" w:hAnsi="Calibri" w:cs="Calibri" w:eastAsia="Calibri"/>
+                <w:b/>
+                <w:i w:val="0"/>
+                <w:color w:val="1B2836"/>
+                <w:sz w:val="21"/>
+              </w:rPr>
+              <w:t>db.environment</w:t>
+            </w:r>
+          </w:p>
+        </w:tc>
+        <w:tc>
+          <w:tcPr>
+            <w:tcW w:type="dxa" w:w="6800"/>
+            <w:tcBorders>
+              <w:top w:val="single" w:sz="4" w:space="0" w:color="D0D7DE"/>
+              <w:left w:val="single" w:sz="4" w:space="0" w:color="D0D7DE"/>
+              <w:bottom w:val="single" w:sz="4" w:space="0" w:color="D0D7DE"/>
+              <w:right w:val="single" w:sz="4" w:space="0" w:color="D0D7DE"/>
+            </w:tcBorders>
+            <w:tcMar>
+              <w:top w:w="60" w:type="dxa"/>
+              <w:left w:w="80" w:type="dxa"/>
+              <w:bottom w:w="60" w:type="dxa"/>
+              <w:right w:w="80" w:type="dxa"/>
+            </w:tcMar>
+          </w:tcPr>
+          <w:p>
+            <w:pPr>
+              <w:spacing w:before="0" w:after="0"/>
+            </w:pPr>
+            <w:r/>
+            <w:r>
+              <w:rPr>
+                <w:rFonts w:ascii="Calibri" w:hAnsi="Calibri" w:cs="Calibri" w:eastAsia="Calibri"/>
+                <w:b w:val="0"/>
+                <w:i w:val="0"/>
+                <w:color w:val="1B2836"/>
+                <w:sz w:val="21"/>
+              </w:rPr>
+              <w:t>Passe MYSQL_ROOT_PASSWORD, MYSQL_DATABASE, MYSQL_USER et MYSQL_PASSWORD. Les deux mots de passe viennent de .env.</w:t>
+            </w:r>
+          </w:p>
+        </w:tc>
+      </w:tr>
+      <w:tr>
+        <w:trPr>
+          <w:cantSplit/>
+        </w:trPr>
+        <w:tc>
+          <w:tcPr>
+            <w:tcW w:type="dxa" w:w="2800"/>
+            <w:tcBorders>
+              <w:top w:val="single" w:sz="4" w:space="0" w:color="D0D7DE"/>
+              <w:left w:val="single" w:sz="4" w:space="0" w:color="D0D7DE"/>
+              <w:bottom w:val="single" w:sz="4" w:space="0" w:color="D0D7DE"/>
+              <w:right w:val="single" w:sz="4" w:space="0" w:color="D0D7DE"/>
+            </w:tcBorders>
+            <w:tcMar>
+              <w:top w:w="60" w:type="dxa"/>
+              <w:left w:w="80" w:type="dxa"/>
+              <w:bottom w:w="60" w:type="dxa"/>
+              <w:right w:w="80" w:type="dxa"/>
+            </w:tcMar>
+            <w:shd w:val="clear" w:color="auto" w:fill="F4F7FB"/>
+          </w:tcPr>
+          <w:p>
+            <w:pPr>
+              <w:spacing w:before="0" w:after="0"/>
+            </w:pPr>
+            <w:r/>
+            <w:r>
+              <w:rPr>
+                <w:rFonts w:ascii="Calibri" w:hAnsi="Calibri" w:cs="Calibri" w:eastAsia="Calibri"/>
+                <w:b/>
+                <w:i w:val="0"/>
+                <w:color w:val="1B2836"/>
+                <w:sz w:val="21"/>
+              </w:rPr>
+              <w:t>db.volumes</w:t>
+            </w:r>
+          </w:p>
+        </w:tc>
+        <w:tc>
+          <w:tcPr>
+            <w:tcW w:type="dxa" w:w="6800"/>
+            <w:tcBorders>
+              <w:top w:val="single" w:sz="4" w:space="0" w:color="D0D7DE"/>
+              <w:left w:val="single" w:sz="4" w:space="0" w:color="D0D7DE"/>
+              <w:bottom w:val="single" w:sz="4" w:space="0" w:color="D0D7DE"/>
+              <w:right w:val="single" w:sz="4" w:space="0" w:color="D0D7DE"/>
+            </w:tcBorders>
+            <w:tcMar>
+              <w:top w:w="60" w:type="dxa"/>
+              <w:left w:w="80" w:type="dxa"/>
+              <w:bottom w:w="60" w:type="dxa"/>
+              <w:right w:w="80" w:type="dxa"/>
+            </w:tcMar>
+            <w:shd w:val="clear" w:color="auto" w:fill="F4F7FB"/>
+          </w:tcPr>
+          <w:p>
+            <w:pPr>
+              <w:spacing w:before="0" w:after="0"/>
+            </w:pPr>
+            <w:r/>
+            <w:r>
+              <w:rPr>
+                <w:rFonts w:ascii="Calibri" w:hAnsi="Calibri" w:cs="Calibri" w:eastAsia="Calibri"/>
+                <w:b w:val="0"/>
+                <w:i w:val="0"/>
+                <w:color w:val="1B2836"/>
+                <w:sz w:val="21"/>
+              </w:rPr>
+              <w:t>Monte le volume nommé db-data sur /var/lib/mysql.</w:t>
+            </w:r>
+          </w:p>
+        </w:tc>
+      </w:tr>
+      <w:tr>
+        <w:trPr>
+          <w:cantSplit/>
+        </w:trPr>
+        <w:tc>
+          <w:tcPr>
+            <w:tcW w:type="dxa" w:w="2800"/>
+            <w:tcBorders>
+              <w:top w:val="single" w:sz="4" w:space="0" w:color="D0D7DE"/>
+              <w:left w:val="single" w:sz="4" w:space="0" w:color="D0D7DE"/>
+              <w:bottom w:val="single" w:sz="4" w:space="0" w:color="D0D7DE"/>
+              <w:right w:val="single" w:sz="4" w:space="0" w:color="D0D7DE"/>
+            </w:tcBorders>
+            <w:tcMar>
+              <w:top w:w="60" w:type="dxa"/>
+              <w:left w:w="80" w:type="dxa"/>
+              <w:bottom w:w="60" w:type="dxa"/>
+              <w:right w:w="80" w:type="dxa"/>
+            </w:tcMar>
+          </w:tcPr>
+          <w:p>
+            <w:pPr>
+              <w:spacing w:before="0" w:after="0"/>
+            </w:pPr>
+            <w:r/>
+            <w:r>
+              <w:rPr>
+                <w:rFonts w:ascii="Calibri" w:hAnsi="Calibri" w:cs="Calibri" w:eastAsia="Calibri"/>
+                <w:b/>
+                <w:i w:val="0"/>
+                <w:color w:val="1B2836"/>
+                <w:sz w:val="21"/>
+              </w:rPr>
+              <w:t>db.healthcheck</w:t>
+            </w:r>
+          </w:p>
+        </w:tc>
+        <w:tc>
+          <w:tcPr>
+            <w:tcW w:type="dxa" w:w="6800"/>
+            <w:tcBorders>
+              <w:top w:val="single" w:sz="4" w:space="0" w:color="D0D7DE"/>
+              <w:left w:val="single" w:sz="4" w:space="0" w:color="D0D7DE"/>
+              <w:bottom w:val="single" w:sz="4" w:space="0" w:color="D0D7DE"/>
+              <w:right w:val="single" w:sz="4" w:space="0" w:color="D0D7DE"/>
+            </w:tcBorders>
+            <w:tcMar>
+              <w:top w:w="60" w:type="dxa"/>
+              <w:left w:w="80" w:type="dxa"/>
+              <w:bottom w:w="60" w:type="dxa"/>
+              <w:right w:w="80" w:type="dxa"/>
+            </w:tcMar>
+          </w:tcPr>
+          <w:p>
+            <w:pPr>
+              <w:spacing w:before="0" w:after="0"/>
+            </w:pPr>
+            <w:r/>
+            <w:r>
+              <w:rPr>
+                <w:rFonts w:ascii="Calibri" w:hAnsi="Calibri" w:cs="Calibri" w:eastAsia="Calibri"/>
+                <w:b w:val="0"/>
+                <w:i w:val="0"/>
+                <w:color w:val="1B2836"/>
+                <w:sz w:val="21"/>
+              </w:rPr>
+              <w:t>mysqladmin ping interroge le serveur local. Le start_period de 40 s laisse finir la première initialisation.</w:t>
+            </w:r>
+          </w:p>
+        </w:tc>
+      </w:tr>
+      <w:tr>
+        <w:trPr>
+          <w:cantSplit/>
+        </w:trPr>
+        <w:tc>
+          <w:tcPr>
+            <w:tcW w:type="dxa" w:w="2800"/>
+            <w:tcBorders>
+              <w:top w:val="single" w:sz="4" w:space="0" w:color="D0D7DE"/>
+              <w:left w:val="single" w:sz="4" w:space="0" w:color="D0D7DE"/>
+              <w:bottom w:val="single" w:sz="4" w:space="0" w:color="D0D7DE"/>
+              <w:right w:val="single" w:sz="4" w:space="0" w:color="D0D7DE"/>
+            </w:tcBorders>
+            <w:tcMar>
+              <w:top w:w="60" w:type="dxa"/>
+              <w:left w:w="80" w:type="dxa"/>
+              <w:bottom w:w="60" w:type="dxa"/>
+              <w:right w:w="80" w:type="dxa"/>
+            </w:tcMar>
+            <w:shd w:val="clear" w:color="auto" w:fill="F4F7FB"/>
+          </w:tcPr>
+          <w:p>
+            <w:pPr>
+              <w:spacing w:before="0" w:after="0"/>
+            </w:pPr>
+            <w:r/>
+            <w:r>
+              <w:rPr>
+                <w:rFonts w:ascii="Calibri" w:hAnsi="Calibri" w:cs="Calibri" w:eastAsia="Calibri"/>
+                <w:b/>
+                <w:i w:val="0"/>
+                <w:color w:val="1B2836"/>
+                <w:sz w:val="21"/>
+              </w:rPr>
+              <w:t>db, sans ports</w:t>
+            </w:r>
+          </w:p>
+        </w:tc>
+        <w:tc>
+          <w:tcPr>
+            <w:tcW w:type="dxa" w:w="6800"/>
+            <w:tcBorders>
+              <w:top w:val="single" w:sz="4" w:space="0" w:color="D0D7DE"/>
+              <w:left w:val="single" w:sz="4" w:space="0" w:color="D0D7DE"/>
+              <w:bottom w:val="single" w:sz="4" w:space="0" w:color="D0D7DE"/>
+              <w:right w:val="single" w:sz="4" w:space="0" w:color="D0D7DE"/>
+            </w:tcBorders>
+            <w:tcMar>
+              <w:top w:w="60" w:type="dxa"/>
+              <w:left w:w="80" w:type="dxa"/>
+              <w:bottom w:w="60" w:type="dxa"/>
+              <w:right w:w="80" w:type="dxa"/>
+            </w:tcMar>
+            <w:shd w:val="clear" w:color="auto" w:fill="F4F7FB"/>
+          </w:tcPr>
+          <w:p>
+            <w:pPr>
+              <w:spacing w:before="0" w:after="0"/>
+            </w:pPr>
+            <w:r/>
+            <w:r>
+              <w:rPr>
+                <w:rFonts w:ascii="Calibri" w:hAnsi="Calibri" w:cs="Calibri" w:eastAsia="Calibri"/>
+                <w:b w:val="0"/>
+                <w:i w:val="0"/>
+                <w:color w:val="1B2836"/>
+                <w:sz w:val="21"/>
+              </w:rPr>
+              <w:t>Aucun port MySQL n’est publié sur le Mac. Seuls les conteneurs d’app-network joignent le port 3306.</w:t>
+            </w:r>
+          </w:p>
+        </w:tc>
+      </w:tr>
+      <w:tr>
+        <w:trPr>
+          <w:cantSplit/>
+        </w:trPr>
+        <w:tc>
+          <w:tcPr>
+            <w:tcW w:type="dxa" w:w="2800"/>
+            <w:tcBorders>
+              <w:top w:val="single" w:sz="4" w:space="0" w:color="D0D7DE"/>
+              <w:left w:val="single" w:sz="4" w:space="0" w:color="D0D7DE"/>
+              <w:bottom w:val="single" w:sz="4" w:space="0" w:color="D0D7DE"/>
+              <w:right w:val="single" w:sz="4" w:space="0" w:color="D0D7DE"/>
+            </w:tcBorders>
+            <w:tcMar>
+              <w:top w:w="60" w:type="dxa"/>
+              <w:left w:w="80" w:type="dxa"/>
+              <w:bottom w:w="60" w:type="dxa"/>
+              <w:right w:w="80" w:type="dxa"/>
+            </w:tcMar>
+          </w:tcPr>
+          <w:p>
+            <w:pPr>
+              <w:spacing w:before="0" w:after="0"/>
+            </w:pPr>
+            <w:r/>
+            <w:r>
+              <w:rPr>
+                <w:rFonts w:ascii="Calibri" w:hAnsi="Calibri" w:cs="Calibri" w:eastAsia="Calibri"/>
+                <w:b/>
+                <w:i w:val="0"/>
+                <w:color w:val="1B2836"/>
+                <w:sz w:val="21"/>
+              </w:rPr>
+              <w:t>adminer</w:t>
+            </w:r>
+          </w:p>
+        </w:tc>
+        <w:tc>
+          <w:tcPr>
+            <w:tcW w:type="dxa" w:w="6800"/>
+            <w:tcBorders>
+              <w:top w:val="single" w:sz="4" w:space="0" w:color="D0D7DE"/>
+              <w:left w:val="single" w:sz="4" w:space="0" w:color="D0D7DE"/>
+              <w:bottom w:val="single" w:sz="4" w:space="0" w:color="D0D7DE"/>
+              <w:right w:val="single" w:sz="4" w:space="0" w:color="D0D7DE"/>
+            </w:tcBorders>
+            <w:tcMar>
+              <w:top w:w="60" w:type="dxa"/>
+              <w:left w:w="80" w:type="dxa"/>
+              <w:bottom w:w="60" w:type="dxa"/>
+              <w:right w:w="80" w:type="dxa"/>
+            </w:tcMar>
+          </w:tcPr>
+          <w:p>
+            <w:pPr>
+              <w:spacing w:before="0" w:after="0"/>
+            </w:pPr>
+            <w:r/>
+            <w:r>
+              <w:rPr>
+                <w:rFonts w:ascii="Calibri" w:hAnsi="Calibri" w:cs="Calibri" w:eastAsia="Calibri"/>
+                <w:b w:val="0"/>
+                <w:i w:val="0"/>
+                <w:color w:val="1B2836"/>
+                <w:sz w:val="21"/>
+              </w:rPr>
+              <w:t>Image adminer:4.8.1. Le port 8080 du conteneur est publié sur 127.0.0.1:8081. Le serveur proposé à la connexion est db.</w:t>
+            </w:r>
+          </w:p>
+        </w:tc>
+      </w:tr>
+      <w:tr>
+        <w:trPr>
+          <w:cantSplit/>
+        </w:trPr>
+        <w:tc>
+          <w:tcPr>
+            <w:tcW w:type="dxa" w:w="2800"/>
+            <w:tcBorders>
+              <w:top w:val="single" w:sz="4" w:space="0" w:color="D0D7DE"/>
+              <w:left w:val="single" w:sz="4" w:space="0" w:color="D0D7DE"/>
+              <w:bottom w:val="single" w:sz="4" w:space="0" w:color="D0D7DE"/>
+              <w:right w:val="single" w:sz="4" w:space="0" w:color="D0D7DE"/>
+            </w:tcBorders>
+            <w:tcMar>
+              <w:top w:w="60" w:type="dxa"/>
+              <w:left w:w="80" w:type="dxa"/>
+              <w:bottom w:w="60" w:type="dxa"/>
+              <w:right w:w="80" w:type="dxa"/>
+            </w:tcMar>
+            <w:shd w:val="clear" w:color="auto" w:fill="F4F7FB"/>
+          </w:tcPr>
+          <w:p>
+            <w:pPr>
+              <w:spacing w:before="0" w:after="0"/>
+            </w:pPr>
+            <w:r/>
+            <w:r>
+              <w:rPr>
+                <w:rFonts w:ascii="Calibri" w:hAnsi="Calibri" w:cs="Calibri" w:eastAsia="Calibri"/>
+                <w:b/>
+                <w:i w:val="0"/>
+                <w:color w:val="1B2836"/>
+                <w:sz w:val="21"/>
+              </w:rPr>
+              <w:t>networks</w:t>
+            </w:r>
+          </w:p>
+        </w:tc>
+        <w:tc>
+          <w:tcPr>
+            <w:tcW w:type="dxa" w:w="6800"/>
+            <w:tcBorders>
+              <w:top w:val="single" w:sz="4" w:space="0" w:color="D0D7DE"/>
+              <w:left w:val="single" w:sz="4" w:space="0" w:color="D0D7DE"/>
+              <w:bottom w:val="single" w:sz="4" w:space="0" w:color="D0D7DE"/>
+              <w:right w:val="single" w:sz="4" w:space="0" w:color="D0D7DE"/>
+            </w:tcBorders>
+            <w:tcMar>
+              <w:top w:w="60" w:type="dxa"/>
+              <w:left w:w="80" w:type="dxa"/>
+              <w:bottom w:w="60" w:type="dxa"/>
+              <w:right w:w="80" w:type="dxa"/>
+            </w:tcMar>
+            <w:shd w:val="clear" w:color="auto" w:fill="F4F7FB"/>
+          </w:tcPr>
+          <w:p>
+            <w:pPr>
+              <w:spacing w:before="0" w:after="0"/>
+            </w:pPr>
+            <w:r/>
+            <w:r>
+              <w:rPr>
+                <w:rFonts w:ascii="Calibri" w:hAnsi="Calibri" w:cs="Calibri" w:eastAsia="Calibri"/>
+                <w:b w:val="0"/>
+                <w:i w:val="0"/>
+                <w:color w:val="1B2836"/>
+                <w:sz w:val="21"/>
+              </w:rPr>
+              <w:t>Crée le réseau bridge nommé app-network et y place les trois services.</w:t>
+            </w:r>
+          </w:p>
+        </w:tc>
+      </w:tr>
+      <w:tr>
+        <w:trPr>
+          <w:cantSplit/>
+        </w:trPr>
+        <w:tc>
+          <w:tcPr>
+            <w:tcW w:type="dxa" w:w="2800"/>
+            <w:tcBorders>
+              <w:top w:val="single" w:sz="4" w:space="0" w:color="D0D7DE"/>
+              <w:left w:val="single" w:sz="4" w:space="0" w:color="D0D7DE"/>
+              <w:bottom w:val="single" w:sz="4" w:space="0" w:color="D0D7DE"/>
+              <w:right w:val="single" w:sz="4" w:space="0" w:color="D0D7DE"/>
+            </w:tcBorders>
+            <w:tcMar>
+              <w:top w:w="60" w:type="dxa"/>
+              <w:left w:w="80" w:type="dxa"/>
+              <w:bottom w:w="60" w:type="dxa"/>
+              <w:right w:w="80" w:type="dxa"/>
+            </w:tcMar>
+          </w:tcPr>
+          <w:p>
+            <w:pPr>
+              <w:spacing w:before="0" w:after="0"/>
+            </w:pPr>
+            <w:r/>
+            <w:r>
+              <w:rPr>
+                <w:rFonts w:ascii="Calibri" w:hAnsi="Calibri" w:cs="Calibri" w:eastAsia="Calibri"/>
+                <w:b/>
+                <w:i w:val="0"/>
+                <w:color w:val="1B2836"/>
+                <w:sz w:val="21"/>
+              </w:rPr>
+              <w:t>volumes</w:t>
+            </w:r>
+          </w:p>
+        </w:tc>
+        <w:tc>
+          <w:tcPr>
+            <w:tcW w:type="dxa" w:w="6800"/>
+            <w:tcBorders>
+              <w:top w:val="single" w:sz="4" w:space="0" w:color="D0D7DE"/>
+              <w:left w:val="single" w:sz="4" w:space="0" w:color="D0D7DE"/>
+              <w:bottom w:val="single" w:sz="4" w:space="0" w:color="D0D7DE"/>
+              <w:right w:val="single" w:sz="4" w:space="0" w:color="D0D7DE"/>
+            </w:tcBorders>
+            <w:tcMar>
+              <w:top w:w="60" w:type="dxa"/>
+              <w:left w:w="80" w:type="dxa"/>
+              <w:bottom w:w="60" w:type="dxa"/>
+              <w:right w:w="80" w:type="dxa"/>
+            </w:tcMar>
+          </w:tcPr>
+          <w:p>
+            <w:pPr>
+              <w:spacing w:before="0" w:after="0"/>
+            </w:pPr>
+            <w:r/>
+            <w:r>
+              <w:rPr>
+                <w:rFonts w:ascii="Calibri" w:hAnsi="Calibri" w:cs="Calibri" w:eastAsia="Calibri"/>
+                <w:b w:val="0"/>
+                <w:i w:val="0"/>
+                <w:color w:val="1B2836"/>
+                <w:sz w:val="21"/>
+              </w:rPr>
+              <w:t>Déclare le volume nommé db-data. docker compose down, sans -v, ne le supprime pas.</w:t>
+            </w:r>
+          </w:p>
+        </w:tc>
+      </w:tr>
+    </w:tbl>
+    <w:p/>
+    <w:p>
+      <w:pPr>
+        <w:pStyle w:val="Heading2"/>
+        <w:spacing w:before="240" w:after="120"/>
+      </w:pPr>
+      <w:r>
+        <w:rPr>
+          <w:rFonts w:ascii="Calibri" w:hAnsi="Calibri" w:cs="Calibri" w:eastAsia="Calibri"/>
+          <w:b/>
+          <w:i w:val="0"/>
+          <w:color w:val="1F4E79"/>
+          <w:sz w:val="26"/>
+        </w:rPr>
+        <w:t>2. Lancement et persistance</w:t>
+      </w:r>
+    </w:p>
+    <w:p>
+      <w:pPr>
+        <w:spacing w:before="0" w:after="160" w:line="259" w:lineRule="auto"/>
+      </w:pPr>
+      <w:r>
+        <w:rPr>
+          <w:rFonts w:ascii="Calibri" w:hAnsi="Calibri" w:cs="Calibri" w:eastAsia="Calibri"/>
+          <w:b w:val="0"/>
+          <w:i w:val="0"/>
+          <w:color w:val="1B2836"/>
+          <w:sz w:val="22"/>
+        </w:rPr>
+        <w:t>docker compose up -d --wait a attendu l’état healthy des trois conteneurs. La page http://127.0.0.1:8080/ répond en HTTP 200, sans erreur PDO. Adminer répond en HTTP 200 sur http://127.0.0.1:8081/.</w:t>
+      </w:r>
+    </w:p>
+    <w:p>
+      <w:pPr>
+        <w:spacing w:before="0" w:after="160" w:line="259" w:lineRule="auto"/>
+      </w:pPr>
+      <w:r>
+        <w:rPr>
+          <w:rFonts w:ascii="Calibri" w:hAnsi="Calibri" w:cs="Calibri" w:eastAsia="Calibri"/>
+          <w:b w:val="0"/>
+          <w:i w:val="0"/>
+          <w:color w:val="1B2836"/>
+          <w:sz w:val="22"/>
+        </w:rPr>
+        <w:t>Un article « Essai de persistance » a été ajouté par le formulaire. docker compose down a supprimé les conteneurs et le réseau app-network. Le volume db-data était encore listé. Après un nouveau docker compose up -d --wait, le même article est affiché sur la page d’accueil.</w:t>
+      </w:r>
+    </w:p>
     <w:sectPr>
       <w:headerReference w:type="default" r:id="rId9"/>
       <w:footerReference w:type="default" r:id="rId10"/>

</xml_diff>

<commit_message>
partie 4 : reseaux et communication inter-conteneurs
</commit_message>
<xml_diff>
--- a/Rapport-LAUMOND_COURCHAY.docx
+++ b/Rapport-LAUMOND_COURCHAY.docx
@@ -5524,6 +5524,448 @@
         <w:t>Un article « Essai de persistance » a été ajouté par le formulaire. docker compose down a supprimé les conteneurs et le réseau app-network. Le volume db-data était encore listé. Après un nouveau docker compose up -d --wait, le même article est affiché sur la page d’accueil.</w:t>
       </w:r>
     </w:p>
+    <w:p>
+      <w:pPr>
+        <w:pStyle w:val="Heading1"/>
+      </w:pPr>
+      <w:r>
+        <w:t>Partie 4 – Réseaux</w:t>
+      </w:r>
+    </w:p>
+    <w:p>
+      <w:r>
+        <w:t>La pile applicative repose sur le réseau bridge nommé app-network. Les conteneurs communiquent entre eux par leurs noms de service sans exposer inutilement de ports sur la machine hôte.</w:t>
+      </w:r>
+    </w:p>
+    <w:p>
+      <w:pPr>
+        <w:pStyle w:val="Heading2"/>
+      </w:pPr>
+      <w:r>
+        <w:t>1. Topologie et inspection du réseau</w:t>
+      </w:r>
+    </w:p>
+    <w:p>
+      <w:r>
+        <w:t>docker network ls liste app-network avec le pilote bridge et un périmètre local. La commande docker network inspect app-network détaille le sous-réseau IPv4 alloué (172.26.0.0/16), la passerelle (172.26.0.1) et les adresses attribuées à chaque conteneur au démarrage.</w:t>
+      </w:r>
+    </w:p>
+    <w:tbl>
+      <w:tblPr>
+        <w:tblW w:type="auto" w:w="0"/>
+        <w:tblLook w:firstColumn="1" w:firstRow="1" w:lastColumn="0" w:lastRow="0" w:noHBand="0" w:noVBand="1" w:val="04A0"/>
+      </w:tblPr>
+      <w:tblGrid>
+        <w:gridCol w:w="2409"/>
+        <w:gridCol w:w="2409"/>
+        <w:gridCol w:w="2409"/>
+        <w:gridCol w:w="2409"/>
+      </w:tblGrid>
+      <w:tr>
+        <w:tc>
+          <w:tcPr>
+            <w:tcW w:type="dxa" w:w="2409"/>
+          </w:tcPr>
+          <w:p>
+            <w:r>
+              <w:t>Conteneur</w:t>
+            </w:r>
+          </w:p>
+        </w:tc>
+        <w:tc>
+          <w:tcPr>
+            <w:tcW w:type="dxa" w:w="2409"/>
+          </w:tcPr>
+          <w:p>
+            <w:r>
+              <w:t>Adresse IP</w:t>
+            </w:r>
+          </w:p>
+        </w:tc>
+        <w:tc>
+          <w:tcPr>
+            <w:tcW w:type="dxa" w:w="2409"/>
+          </w:tcPr>
+          <w:p>
+            <w:r>
+              <w:t>Ports internes</w:t>
+            </w:r>
+          </w:p>
+        </w:tc>
+        <w:tc>
+          <w:tcPr>
+            <w:tcW w:type="dxa" w:w="2409"/>
+          </w:tcPr>
+          <w:p>
+            <w:r>
+              <w:t>Publication hôte</w:t>
+            </w:r>
+          </w:p>
+        </w:tc>
+      </w:tr>
+      <w:tr>
+        <w:tc>
+          <w:tcPr>
+            <w:tcW w:type="dxa" w:w="2409"/>
+          </w:tcPr>
+          <w:p>
+            <w:r>
+              <w:t>db</w:t>
+            </w:r>
+          </w:p>
+        </w:tc>
+        <w:tc>
+          <w:tcPr>
+            <w:tcW w:type="dxa" w:w="2409"/>
+          </w:tcPr>
+          <w:p>
+            <w:r>
+              <w:t>172.26.0.2</w:t>
+            </w:r>
+          </w:p>
+        </w:tc>
+        <w:tc>
+          <w:tcPr>
+            <w:tcW w:type="dxa" w:w="2409"/>
+          </w:tcPr>
+          <w:p>
+            <w:r>
+              <w:t>3306/tcp, 33060/tcp</w:t>
+            </w:r>
+          </w:p>
+        </w:tc>
+        <w:tc>
+          <w:tcPr>
+            <w:tcW w:type="dxa" w:w="2409"/>
+          </w:tcPr>
+          <w:p>
+            <w:r>
+              <w:t>Aucun (interne au réseau)</w:t>
+            </w:r>
+          </w:p>
+        </w:tc>
+      </w:tr>
+      <w:tr>
+        <w:tc>
+          <w:tcPr>
+            <w:tcW w:type="dxa" w:w="2409"/>
+          </w:tcPr>
+          <w:p>
+            <w:r>
+              <w:t>web</w:t>
+            </w:r>
+          </w:p>
+        </w:tc>
+        <w:tc>
+          <w:tcPr>
+            <w:tcW w:type="dxa" w:w="2409"/>
+          </w:tcPr>
+          <w:p>
+            <w:r>
+              <w:t>172.26.0.3</w:t>
+            </w:r>
+          </w:p>
+        </w:tc>
+        <w:tc>
+          <w:tcPr>
+            <w:tcW w:type="dxa" w:w="2409"/>
+          </w:tcPr>
+          <w:p>
+            <w:r>
+              <w:t>80/tcp</w:t>
+            </w:r>
+          </w:p>
+        </w:tc>
+        <w:tc>
+          <w:tcPr>
+            <w:tcW w:type="dxa" w:w="2409"/>
+          </w:tcPr>
+          <w:p>
+            <w:r>
+              <w:t>127.0.0.1:8080 vers le port 80</w:t>
+            </w:r>
+          </w:p>
+        </w:tc>
+      </w:tr>
+      <w:tr>
+        <w:tc>
+          <w:tcPr>
+            <w:tcW w:type="dxa" w:w="2409"/>
+          </w:tcPr>
+          <w:p>
+            <w:r>
+              <w:t>adminer</w:t>
+            </w:r>
+          </w:p>
+        </w:tc>
+        <w:tc>
+          <w:tcPr>
+            <w:tcW w:type="dxa" w:w="2409"/>
+          </w:tcPr>
+          <w:p>
+            <w:r>
+              <w:t>172.26.0.4</w:t>
+            </w:r>
+          </w:p>
+        </w:tc>
+        <w:tc>
+          <w:tcPr>
+            <w:tcW w:type="dxa" w:w="2409"/>
+          </w:tcPr>
+          <w:p>
+            <w:r>
+              <w:t>8080/tcp</w:t>
+            </w:r>
+          </w:p>
+        </w:tc>
+        <w:tc>
+          <w:tcPr>
+            <w:tcW w:type="dxa" w:w="2409"/>
+          </w:tcPr>
+          <w:p>
+            <w:r>
+              <w:t>127.0.0.1:8081 vers le port 8080</w:t>
+            </w:r>
+          </w:p>
+        </w:tc>
+      </w:tr>
+    </w:tbl>
+    <w:p>
+      <w:pPr>
+        <w:pStyle w:val="Heading2"/>
+      </w:pPr>
+      <w:r>
+        <w:t>2. Résolution DNS et connectivité inter-conteneurs</w:t>
+      </w:r>
+    </w:p>
+    <w:p>
+      <w:r>
+        <w:t>Sur les réseaux bridge personnalisés, Docker intègre un résolveur DNS interne (127.0.0.11). Chaque conteneur résout dynamiquement les autres par leur nom de service Compose, sans recourir à des adresses IP fixes. La commande getent hosts db exécutée dans web confirme la résolution de db en 172.26.0.2. C'est ce mécanisme qui permet à db-config.php de joindre MySQL avec DB_HOST=db.</w:t>
+      </w:r>
+    </w:p>
+    <w:p>
+      <w:r>
+        <w:t>Deux tests complémentaires valident la liaison entre web et db :</w:t>
+      </w:r>
+    </w:p>
+    <w:tbl>
+      <w:tblPr>
+        <w:tblW w:type="auto" w:w="0"/>
+        <w:tblLook w:firstColumn="1" w:firstRow="1" w:lastColumn="0" w:lastRow="0" w:noHBand="0" w:noVBand="1" w:val="04A0"/>
+      </w:tblPr>
+      <w:tblGrid>
+        <w:gridCol w:w="3213"/>
+        <w:gridCol w:w="3213"/>
+        <w:gridCol w:w="3213"/>
+      </w:tblGrid>
+      <w:tr>
+        <w:tc>
+          <w:tcPr>
+            <w:tcW w:type="dxa" w:w="3213"/>
+          </w:tcPr>
+          <w:p>
+            <w:r>
+              <w:t>Test</w:t>
+            </w:r>
+          </w:p>
+        </w:tc>
+        <w:tc>
+          <w:tcPr>
+            <w:tcW w:type="dxa" w:w="3213"/>
+          </w:tcPr>
+          <w:p>
+            <w:r>
+              <w:t>Commande exécutée</w:t>
+            </w:r>
+          </w:p>
+        </w:tc>
+        <w:tc>
+          <w:tcPr>
+            <w:tcW w:type="dxa" w:w="3213"/>
+          </w:tcPr>
+          <w:p>
+            <w:r>
+              <w:t>Résultat et interprétation</w:t>
+            </w:r>
+          </w:p>
+        </w:tc>
+      </w:tr>
+      <w:tr>
+        <w:tc>
+          <w:tcPr>
+            <w:tcW w:type="dxa" w:w="3213"/>
+          </w:tcPr>
+          <w:p>
+            <w:r>
+              <w:t>Connectivité niveau 3 (ICMP)</w:t>
+            </w:r>
+          </w:p>
+        </w:tc>
+        <w:tc>
+          <w:tcPr>
+            <w:tcW w:type="dxa" w:w="3213"/>
+          </w:tcPr>
+          <w:p>
+            <w:r>
+              <w:t>docker exec web ping -c 3 db</w:t>
+            </w:r>
+          </w:p>
+        </w:tc>
+        <w:tc>
+          <w:tcPr>
+            <w:tcW w:type="dxa" w:w="3213"/>
+          </w:tcPr>
+          <w:p>
+            <w:r>
+              <w:t>3 paquets transmis et reçus sans aucune perte, avec une latence moyenne de 0,5 ms. Le paquet iputils-ping a été ajouté au Dockerfile web pour autoriser ce diagnostic sans alourdir l'image (191 Ko).</w:t>
+            </w:r>
+          </w:p>
+        </w:tc>
+      </w:tr>
+      <w:tr>
+        <w:tc>
+          <w:tcPr>
+            <w:tcW w:type="dxa" w:w="3213"/>
+          </w:tcPr>
+          <w:p>
+            <w:r>
+              <w:t>Connectivité niveau 4/7 (TCP)</w:t>
+            </w:r>
+          </w:p>
+        </w:tc>
+        <w:tc>
+          <w:tcPr>
+            <w:tcW w:type="dxa" w:w="3213"/>
+          </w:tcPr>
+          <w:p>
+            <w:r>
+              <w:t>docker exec web curl -v http://db:3306</w:t>
+            </w:r>
+          </w:p>
+        </w:tc>
+        <w:tc>
+          <w:tcPr>
+            <w:tcW w:type="dxa" w:w="3213"/>
+          </w:tcPr>
+          <w:p>
+            <w:r>
+              <w:t>curl résout db en 172.26.0.2 et ouvre la connexion TCP sur le port 3306 (Connected to db (172.26.0.2) port 3306). Le message Received HTTP/0.9 when not allowed provient du handshake binaire émis par MySQL en réponse à une requête HTTP, confirmant que le démon écoute et répond.</w:t>
+            </w:r>
+          </w:p>
+        </w:tc>
+      </w:tr>
+    </w:tbl>
+    <w:p>
+      <w:pPr>
+        <w:pStyle w:val="Heading2"/>
+      </w:pPr>
+      <w:r>
+        <w:t>3. Isolation et intérêt du bridge personnalisé</w:t>
+      </w:r>
+    </w:p>
+    <w:p>
+      <w:r>
+        <w:t>L'utilisation d'un réseau bridge utilisateur apporte trois garanties essentielles par rapport au bridge par défaut de Docker :</w:t>
+      </w:r>
+    </w:p>
+    <w:tbl>
+      <w:tblPr>
+        <w:tblW w:type="auto" w:w="0"/>
+        <w:tblLook w:firstColumn="1" w:firstRow="1" w:lastColumn="0" w:lastRow="0" w:noHBand="0" w:noVBand="1" w:val="04A0"/>
+      </w:tblPr>
+      <w:tblGrid>
+        <w:gridCol w:w="4819"/>
+        <w:gridCol w:w="4819"/>
+      </w:tblGrid>
+      <w:tr>
+        <w:tc>
+          <w:tcPr>
+            <w:tcW w:type="dxa" w:w="4819"/>
+          </w:tcPr>
+          <w:p>
+            <w:r>
+              <w:t>Propriété</w:t>
+            </w:r>
+          </w:p>
+        </w:tc>
+        <w:tc>
+          <w:tcPr>
+            <w:tcW w:type="dxa" w:w="4819"/>
+          </w:tcPr>
+          <w:p>
+            <w:r>
+              <w:t>Bénéfice technique et sécurité</w:t>
+            </w:r>
+          </w:p>
+        </w:tc>
+      </w:tr>
+      <w:tr>
+        <w:tc>
+          <w:tcPr>
+            <w:tcW w:type="dxa" w:w="4819"/>
+          </w:tcPr>
+          <w:p>
+            <w:r>
+              <w:t>Résolution DNS native</w:t>
+            </w:r>
+          </w:p>
+        </w:tc>
+        <w:tc>
+          <w:tcPr>
+            <w:tcW w:type="dxa" w:w="4819"/>
+          </w:tcPr>
+          <w:p>
+            <w:r>
+              <w:t>Les conteneurs sur app-network s'adressent par nom de service. Le réseau bridge par défaut impose des liaisons manuelles (--link, dépréciées) ou des adresses IP fixes instables.</w:t>
+            </w:r>
+          </w:p>
+        </w:tc>
+      </w:tr>
+      <w:tr>
+        <w:tc>
+          <w:tcPr>
+            <w:tcW w:type="dxa" w:w="4819"/>
+          </w:tcPr>
+          <w:p>
+            <w:r>
+              <w:t>Étanchéité et cloisonnement</w:t>
+            </w:r>
+          </w:p>
+        </w:tc>
+        <w:tc>
+          <w:tcPr>
+            <w:tcW w:type="dxa" w:w="4819"/>
+          </w:tcPr>
+          <w:p>
+            <w:r>
+              <w:t>Les conteneurs lancés hors de ce Compose ou sur le bridge par défaut ne peuvent ni voir ni interroger db. Une compromission sur un conteneur tiers ne donne aucun accès réseau à cette base.</w:t>
+            </w:r>
+          </w:p>
+        </w:tc>
+      </w:tr>
+      <w:tr>
+        <w:tc>
+          <w:tcPr>
+            <w:tcW w:type="dxa" w:w="4819"/>
+          </w:tcPr>
+          <w:p>
+            <w:r>
+              <w:t>Protection du port 3306</w:t>
+            </w:r>
+          </w:p>
+        </w:tc>
+        <w:tc>
+          <w:tcPr>
+            <w:tcW w:type="dxa" w:w="4819"/>
+          </w:tcPr>
+          <w:p>
+            <w:r>
+              <w:t>Aucun port MySQL n'est publié sur la machine hôte. Seuls web et adminer, placés sur app-network, peuvent envoyer des requêtes vers 3306. La surface d'exposition de l'hôte reste limitée à 8080 et 8081.</w:t>
+            </w:r>
+          </w:p>
+        </w:tc>
+      </w:tr>
+    </w:tbl>
     <w:sectPr>
       <w:headerReference w:type="default" r:id="rId9"/>
       <w:footerReference w:type="default" r:id="rId10"/>

</xml_diff>

<commit_message>
partie 5 : securite et bonnes pratiques
</commit_message>
<xml_diff>
--- a/Rapport-LAUMOND_COURCHAY.docx
+++ b/Rapport-LAUMOND_COURCHAY.docx
@@ -5966,6 +5966,361 @@
         </w:tc>
       </w:tr>
     </w:tbl>
+    <w:p>
+      <w:pPr>
+        <w:pStyle w:val="Heading1"/>
+      </w:pPr>
+      <w:r>
+        <w:t>Partie 5 – Sécurité</w:t>
+      </w:r>
+    </w:p>
+    <w:p>
+      <w:r>
+        <w:t>La sécurité de la pile est appliquée selon le principe de défense en profondeur : audit des vulnérabilités statiques, étanchéité de la gestion des secrets, restriction radicale des privilèges à l'exécution et interdiction stricte de permissions permissives.</w:t>
+      </w:r>
+    </w:p>
+    <w:p>
+      <w:pPr>
+        <w:pStyle w:val="Heading2"/>
+      </w:pPr>
+      <w:r>
+        <w:t>1. Scans de vulnérabilités (Trivy)</w:t>
+      </w:r>
+    </w:p>
+    <w:p>
+      <w:r>
+        <w:t>Les deux images produites ont été soumises à un scan statique de vulnérabilités avec Trivy (aquasec/trivy) ciblant les sévérités HIGH et CRITICAL.</w:t>
+      </w:r>
+    </w:p>
+    <w:tbl>
+      <w:tblPr>
+        <w:tblW w:type="auto" w:w="0"/>
+        <w:tblLook w:firstColumn="1" w:firstRow="1" w:lastColumn="0" w:lastRow="0" w:noHBand="0" w:noVBand="1" w:val="04A0"/>
+      </w:tblPr>
+      <w:tblGrid>
+        <w:gridCol w:w="2409"/>
+        <w:gridCol w:w="2409"/>
+        <w:gridCol w:w="2409"/>
+        <w:gridCol w:w="2409"/>
+      </w:tblGrid>
+      <w:tr>
+        <w:tc>
+          <w:tcPr>
+            <w:tcW w:type="dxa" w:w="2409"/>
+          </w:tcPr>
+          <w:p>
+            <w:r>
+              <w:t>Image scannée</w:t>
+            </w:r>
+          </w:p>
+        </w:tc>
+        <w:tc>
+          <w:tcPr>
+            <w:tcW w:type="dxa" w:w="2409"/>
+          </w:tcPr>
+          <w:p>
+            <w:r>
+              <w:t>Base OS</w:t>
+            </w:r>
+          </w:p>
+        </w:tc>
+        <w:tc>
+          <w:tcPr>
+            <w:tcW w:type="dxa" w:w="2409"/>
+          </w:tcPr>
+          <w:p>
+            <w:r>
+              <w:t>Vulnérabilités détectées</w:t>
+            </w:r>
+          </w:p>
+        </w:tc>
+        <w:tc>
+          <w:tcPr>
+            <w:tcW w:type="dxa" w:w="2409"/>
+          </w:tcPr>
+          <w:p>
+            <w:r>
+              <w:t>Failles critiques et analyse</w:t>
+            </w:r>
+          </w:p>
+        </w:tc>
+      </w:tr>
+      <w:tr>
+        <w:tc>
+          <w:tcPr>
+            <w:tcW w:type="dxa" w:w="2409"/>
+          </w:tcPr>
+          <w:p>
+            <w:r>
+              <w:t>articles-web:dev</w:t>
+            </w:r>
+          </w:p>
+        </w:tc>
+        <w:tc>
+          <w:tcPr>
+            <w:tcW w:type="dxa" w:w="2409"/>
+          </w:tcPr>
+          <w:p>
+            <w:r>
+              <w:t>Debian 13 (Trixie)</w:t>
+            </w:r>
+          </w:p>
+        </w:tc>
+        <w:tc>
+          <w:tcPr>
+            <w:tcW w:type="dxa" w:w="2409"/>
+          </w:tcPr>
+          <w:p>
+            <w:r>
+              <w:t>120 (117 HIGH, 3 CRITICAL)</w:t>
+            </w:r>
+          </w:p>
+        </w:tc>
+        <w:tc>
+          <w:tcPr>
+            <w:tcW w:type="dxa" w:w="2409"/>
+          </w:tcPr>
+          <w:p>
+            <w:r>
+              <w:t>libxml2 (CVE-2026-6653) et linux-libc-dev (CVE-2026-93221). Ces failles sont héritées de l'image de base Debian. Pour une mise en production, une base Alpine réduirait drastiquement ce volume.</w:t>
+            </w:r>
+          </w:p>
+        </w:tc>
+      </w:tr>
+      <w:tr>
+        <w:tc>
+          <w:tcPr>
+            <w:tcW w:type="dxa" w:w="2409"/>
+          </w:tcPr>
+          <w:p>
+            <w:r>
+              <w:t>articles-db:dev</w:t>
+            </w:r>
+          </w:p>
+        </w:tc>
+        <w:tc>
+          <w:tcPr>
+            <w:tcW w:type="dxa" w:w="2409"/>
+          </w:tcPr>
+          <w:p>
+            <w:r>
+              <w:t>Oracle Linux / MySQL 8.4</w:t>
+            </w:r>
+          </w:p>
+        </w:tc>
+        <w:tc>
+          <w:tcPr>
+            <w:tcW w:type="dxa" w:w="2409"/>
+          </w:tcPr>
+          <w:p>
+            <w:r>
+              <w:t>35 (33 HIGH, 2 CRITICAL)</w:t>
+            </w:r>
+          </w:p>
+        </w:tc>
+        <w:tc>
+          <w:tcPr>
+            <w:tcW w:type="dxa" w:w="2409"/>
+          </w:tcPr>
+          <w:p>
+            <w:r>
+              <w:t>certifi (GHSA-6q48-6c7w-9gw2) et gosu (CVE-2025-68121). L'image officielle isole le processus mysqld avec l'utilisateur mysql après initialisation.</w:t>
+            </w:r>
+          </w:p>
+        </w:tc>
+      </w:tr>
+    </w:tbl>
+    <w:p>
+      <w:pPr>
+        <w:pStyle w:val="Heading2"/>
+      </w:pPr>
+      <w:r>
+        <w:t>2. Gestion des secrets</w:t>
+      </w:r>
+    </w:p>
+    <w:p>
+      <w:r>
+        <w:t>Aucun mot de passe ni identifiant sensible n'est consigné dans les Dockerfiles ou le fichier docker-compose.yml. Les secrets sont centralisés dans le fichier .env, qui est exclu du versionnement par .gitignore. Le fichier .dockerignore garantit également qu'un COPY large n'embarque jamais le fichier .env dans une image.</w:t>
+      </w:r>
+    </w:p>
+    <w:p>
+      <w:r>
+        <w:t>Dans docker-compose.yml, l'interpolation obligatoire (${DB_PASS:?Definir DB_PASS dans .env} et ${MYSQL_ROOT_PASSWORD:?...}) bloque immédiatement le démarrage de la pile si les secrets ne sont pas définis.</w:t>
+      </w:r>
+    </w:p>
+    <w:p>
+      <w:pPr>
+        <w:pStyle w:val="Heading2"/>
+      </w:pPr>
+      <w:r>
+        <w:t>3. Limitation des privilèges et durcissement à l'exécution</w:t>
+      </w:r>
+    </w:p>
+    <w:p>
+      <w:r>
+        <w:t>Le service web a fait l'objet d'un durcissement poussé dans docker-compose.yml afin de confiner strictement le conteneur en cas d'exploitation d'une faille applicative PHP :</w:t>
+      </w:r>
+    </w:p>
+    <w:tbl>
+      <w:tblPr>
+        <w:tblW w:type="auto" w:w="0"/>
+        <w:tblLook w:firstColumn="1" w:firstRow="1" w:lastColumn="0" w:lastRow="0" w:noHBand="0" w:noVBand="1" w:val="04A0"/>
+      </w:tblPr>
+      <w:tblGrid>
+        <w:gridCol w:w="4819"/>
+        <w:gridCol w:w="4819"/>
+      </w:tblGrid>
+      <w:tr>
+        <w:tc>
+          <w:tcPr>
+            <w:tcW w:type="dxa" w:w="4819"/>
+          </w:tcPr>
+          <w:p>
+            <w:r>
+              <w:t>Paramètre de sécurité</w:t>
+            </w:r>
+          </w:p>
+        </w:tc>
+        <w:tc>
+          <w:tcPr>
+            <w:tcW w:type="dxa" w:w="4819"/>
+          </w:tcPr>
+          <w:p>
+            <w:r>
+              <w:t>Mécanisme et justification</w:t>
+            </w:r>
+          </w:p>
+        </w:tc>
+      </w:tr>
+      <w:tr>
+        <w:tc>
+          <w:tcPr>
+            <w:tcW w:type="dxa" w:w="4819"/>
+          </w:tcPr>
+          <w:p>
+            <w:r>
+              <w:t>USER www-data (UID 33)</w:t>
+            </w:r>
+          </w:p>
+        </w:tc>
+        <w:tc>
+          <w:tcPr>
+            <w:tcW w:type="dxa" w:w="4819"/>
+          </w:tcPr>
+          <w:p>
+            <w:r>
+              <w:t>Le conteneur web n'exécute aucun processus en root. La compromission d'Apache ne donne aucun accès root sur l'hôte.</w:t>
+            </w:r>
+          </w:p>
+        </w:tc>
+      </w:tr>
+      <w:tr>
+        <w:tc>
+          <w:tcPr>
+            <w:tcW w:type="dxa" w:w="4819"/>
+          </w:tcPr>
+          <w:p>
+            <w:r>
+              <w:t>read_only: true</w:t>
+            </w:r>
+          </w:p>
+        </w:tc>
+        <w:tc>
+          <w:tcPr>
+            <w:tcW w:type="dxa" w:w="4819"/>
+          </w:tcPr>
+          <w:p>
+            <w:r>
+              <w:t>Le système de fichiers racine du conteneur est monté en lecture seule. Un attaquant ne peut ni modifier index.php ni déposer de webshell. Une commande touch /var/www/html/test.txt renvoie l'erreur 'Read-only file system'.</w:t>
+            </w:r>
+          </w:p>
+        </w:tc>
+      </w:tr>
+      <w:tr>
+        <w:tc>
+          <w:tcPr>
+            <w:tcW w:type="dxa" w:w="4819"/>
+          </w:tcPr>
+          <w:p>
+            <w:r>
+              <w:t>security_opt: no-new-privileges</w:t>
+            </w:r>
+          </w:p>
+        </w:tc>
+        <w:tc>
+          <w:tcPr>
+            <w:tcW w:type="dxa" w:w="4819"/>
+          </w:tcPr>
+          <w:p>
+            <w:r>
+              <w:t>Interdit formellement aux processus du conteneur d'acquérir de nouveaux privilèges via des binaires setuid/setgid.</w:t>
+            </w:r>
+          </w:p>
+        </w:tc>
+      </w:tr>
+      <w:tr>
+        <w:tc>
+          <w:tcPr>
+            <w:tcW w:type="dxa" w:w="4819"/>
+          </w:tcPr>
+          <w:p>
+            <w:r>
+              <w:t>cap_drop: ALL / cap_add: NET_BIND_SERVICE</w:t>
+            </w:r>
+          </w:p>
+        </w:tc>
+        <w:tc>
+          <w:tcPr>
+            <w:tcW w:type="dxa" w:w="4819"/>
+          </w:tcPr>
+          <w:p>
+            <w:r>
+              <w:t>Toutes les Linux Capabilities sont retirées. Seule NET_BIND_SERVICE est accordée pour qu'Apache (non-root) puisse ouvrir le port 80.</w:t>
+            </w:r>
+          </w:p>
+        </w:tc>
+      </w:tr>
+      <w:tr>
+        <w:tc>
+          <w:tcPr>
+            <w:tcW w:type="dxa" w:w="4819"/>
+          </w:tcPr>
+          <w:p>
+            <w:r>
+              <w:t>tmpfs (volumes volatils en RAM)</w:t>
+            </w:r>
+          </w:p>
+        </w:tc>
+        <w:tc>
+          <w:tcPr>
+            <w:tcW w:type="dxa" w:w="4819"/>
+          </w:tcPr>
+          <w:p>
+            <w:r>
+              <w:t>Des montages temporaires en RAM avec les options noexec,nosuid sont alloués à /var/run/apache2, /var/lock/apache2, /var/log/apache2 et /tmp pour permettre à Apache de consigner son PID et ses logs sans compromettre l'immuabilité du système de fichiers.</w:t>
+            </w:r>
+          </w:p>
+        </w:tc>
+      </w:tr>
+    </w:tbl>
+    <w:p>
+      <w:pPr>
+        <w:pStyle w:val="Heading2"/>
+      </w:pPr>
+      <w:r>
+        <w:t>4. Bannissement du mode chmod 777</w:t>
+      </w:r>
+    </w:p>
+    <w:p>
+      <w:r>
+        <w:t>L'utilisation d'un chmod 777 constitue une faille de sécurité majeure car elle octroie les droits de lecture, écriture et exécution à tous les utilisateurs du système. Un attaquant exploitant une vulnérabilité pourrait écraser le code source ou y insérer des portes dérobées.</w:t>
+      </w:r>
+    </w:p>
+    <w:p>
+      <w:r>
+        <w:t>L'application ne gérant aucun téléversement de fichier, les sources appartiennent à www-data:www-data avec des permissions de lecture stricte (fichiers 644, répertoires 755), protégeant l'intégrité du code.</w:t>
+      </w:r>
+    </w:p>
     <w:sectPr>
       <w:headerReference w:type="default" r:id="rId9"/>
       <w:footerReference w:type="default" r:id="rId10"/>

</xml_diff>

<commit_message>
partie 6 : optimisation des images et du build
</commit_message>
<xml_diff>
--- a/Rapport-LAUMOND_COURCHAY.docx
+++ b/Rapport-LAUMOND_COURCHAY.docx
@@ -6321,6 +6321,326 @@
         <w:t>L'application ne gérant aucun téléversement de fichier, les sources appartiennent à www-data:www-data avec des permissions de lecture stricte (fichiers 644, répertoires 755), protégeant l'intégrité du code.</w:t>
       </w:r>
     </w:p>
+    <w:p>
+      <w:pPr>
+        <w:pStyle w:val="Heading1"/>
+      </w:pPr>
+      <w:r>
+        <w:t>Partie 6 – Optimisation</w:t>
+      </w:r>
+    </w:p>
+    <w:p>
+      <w:r>
+        <w:t>L'optimisation des conteneurs réduit l'empreinte disque, accélère les temps de transfert réseau et diminue la surface d'attaque en écartant tout fichier ou paquet superflu.</w:t>
+      </w:r>
+    </w:p>
+    <w:p>
+      <w:pPr>
+        <w:pStyle w:val="Heading2"/>
+      </w:pPr>
+      <w:r>
+        <w:t>1. Comparatif de taille des images</w:t>
+      </w:r>
+    </w:p>
+    <w:p>
+      <w:r>
+        <w:t>Les mesures effectuées sur les images locales et sur des alternatives légères mettent en évidence les gains d'optimisation potentiels :</w:t>
+      </w:r>
+    </w:p>
+    <w:tbl>
+      <w:tblPr>
+        <w:tblW w:type="auto" w:w="0"/>
+        <w:tblLook w:firstColumn="1" w:firstRow="1" w:lastColumn="0" w:lastRow="0" w:noHBand="0" w:noVBand="1" w:val="04A0"/>
+      </w:tblPr>
+      <w:tblGrid>
+        <w:gridCol w:w="2409"/>
+        <w:gridCol w:w="2409"/>
+        <w:gridCol w:w="2409"/>
+        <w:gridCol w:w="2409"/>
+      </w:tblGrid>
+      <w:tr>
+        <w:tc>
+          <w:tcPr>
+            <w:tcW w:type="dxa" w:w="2409"/>
+          </w:tcPr>
+          <w:p>
+            <w:r>
+              <w:t>Service</w:t>
+            </w:r>
+          </w:p>
+        </w:tc>
+        <w:tc>
+          <w:tcPr>
+            <w:tcW w:type="dxa" w:w="2409"/>
+          </w:tcPr>
+          <w:p>
+            <w:r>
+              <w:t>Image actuelle</w:t>
+            </w:r>
+          </w:p>
+        </w:tc>
+        <w:tc>
+          <w:tcPr>
+            <w:tcW w:type="dxa" w:w="2409"/>
+          </w:tcPr>
+          <w:p>
+            <w:r>
+              <w:t>Variante allégée</w:t>
+            </w:r>
+          </w:p>
+        </w:tc>
+        <w:tc>
+          <w:tcPr>
+            <w:tcW w:type="dxa" w:w="2409"/>
+          </w:tcPr>
+          <w:p>
+            <w:r>
+              <w:t>Gain d'espace mesuré</w:t>
+            </w:r>
+          </w:p>
+        </w:tc>
+      </w:tr>
+      <w:tr>
+        <w:tc>
+          <w:tcPr>
+            <w:tcW w:type="dxa" w:w="2409"/>
+          </w:tcPr>
+          <w:p>
+            <w:r>
+              <w:t>Service Web (PHP/Apache)</w:t>
+            </w:r>
+          </w:p>
+        </w:tc>
+        <w:tc>
+          <w:tcPr>
+            <w:tcW w:type="dxa" w:w="2409"/>
+          </w:tcPr>
+          <w:p>
+            <w:r>
+              <w:t>articles-web:dev (711 Mo)</w:t>
+            </w:r>
+          </w:p>
+        </w:tc>
+        <w:tc>
+          <w:tcPr>
+            <w:tcW w:type="dxa" w:w="2409"/>
+          </w:tcPr>
+          <w:p>
+            <w:r>
+              <w:t>php:8.2-fpm-alpine (118 Mo)</w:t>
+            </w:r>
+          </w:p>
+        </w:tc>
+        <w:tc>
+          <w:tcPr>
+            <w:tcW w:type="dxa" w:w="2409"/>
+          </w:tcPr>
+          <w:p>
+            <w:r>
+              <w:t>- 83,4 % d'empreinte disque (gain de 593 Mo). Alpine élimine tout l'espace utilisateur Debian.</w:t>
+            </w:r>
+          </w:p>
+        </w:tc>
+      </w:tr>
+      <w:tr>
+        <w:tc>
+          <w:tcPr>
+            <w:tcW w:type="dxa" w:w="2409"/>
+          </w:tcPr>
+          <w:p>
+            <w:r>
+              <w:t>Service Base (SQL)</w:t>
+            </w:r>
+          </w:p>
+        </w:tc>
+        <w:tc>
+          <w:tcPr>
+            <w:tcW w:type="dxa" w:w="2409"/>
+          </w:tcPr>
+          <w:p>
+            <w:r>
+              <w:t>articles-db:dev (1,1 Go)</w:t>
+            </w:r>
+          </w:p>
+        </w:tc>
+        <w:tc>
+          <w:tcPr>
+            <w:tcW w:type="dxa" w:w="2409"/>
+          </w:tcPr>
+          <w:p>
+            <w:r>
+              <w:t>mariadb:lts (460 Mo)</w:t>
+            </w:r>
+          </w:p>
+        </w:tc>
+        <w:tc>
+          <w:tcPr>
+            <w:tcW w:type="dxa" w:w="2409"/>
+          </w:tcPr>
+          <w:p>
+            <w:r>
+              <w:t>- 58,2 % d'empreinte disque (gain de 640 Mo). MariaDB allège le runtime par rapport à MySQL 8.4.</w:t>
+            </w:r>
+          </w:p>
+        </w:tc>
+      </w:tr>
+      <w:tr>
+        <w:tc>
+          <w:tcPr>
+            <w:tcW w:type="dxa" w:w="2409"/>
+          </w:tcPr>
+          <w:p>
+            <w:r>
+              <w:t>Contexte de build Docker</w:t>
+            </w:r>
+          </w:p>
+        </w:tc>
+        <w:tc>
+          <w:tcPr>
+            <w:tcW w:type="dxa" w:w="2409"/>
+          </w:tcPr>
+          <w:p>
+            <w:r>
+              <w:t>Contexte brut (~3,5 Mo)</w:t>
+            </w:r>
+          </w:p>
+        </w:tc>
+        <w:tc>
+          <w:tcPr>
+            <w:tcW w:type="dxa" w:w="2409"/>
+          </w:tcPr>
+          <w:p>
+            <w:r>
+              <w:t>Contexte épuré (6,65 Ko)</w:t>
+            </w:r>
+          </w:p>
+        </w:tc>
+        <w:tc>
+          <w:tcPr>
+            <w:tcW w:type="dxa" w:w="2409"/>
+          </w:tcPr>
+          <w:p>
+            <w:r>
+              <w:t>- 99,8 % de données transférées au démon lors du docker build grâce au .dockerignore.</w:t>
+            </w:r>
+          </w:p>
+        </w:tc>
+      </w:tr>
+    </w:tbl>
+    <w:p>
+      <w:pPr>
+        <w:pStyle w:val="Heading2"/>
+      </w:pPr>
+      <w:r>
+        <w:t>2. Nettoyage des couches (Layers)</w:t>
+      </w:r>
+    </w:p>
+    <w:p>
+      <w:r>
+        <w:t>Dans le Dockerfile du service web, la création de couches intermédiaires a été strictement contenue :</w:t>
+      </w:r>
+    </w:p>
+    <w:p>
+      <w:pPr>
+        <w:pStyle w:val="ListBullet"/>
+      </w:pPr>
+      <w:r>
+        <w:rPr>
+          <w:b/>
+        </w:rPr>
+        <w:t xml:space="preserve">Chaînage des commandes : </w:t>
+      </w:r>
+      <w:r>
+        <w:t>L'ensemble des opérations apt, l'installation des extensions PHP, la pose de la capacité cap_net_bind_service et le nettoyage sont regroupés dans un unique RUN relié par des &amp;&amp;. Cela produit une seule couche applicative de 2,02 Mo au-dessus de l'image de base.</w:t>
+      </w:r>
+    </w:p>
+    <w:p>
+      <w:pPr>
+        <w:pStyle w:val="ListBullet"/>
+      </w:pPr>
+      <w:r>
+        <w:rPr>
+          <w:b/>
+        </w:rPr>
+        <w:t xml:space="preserve">Option --no-install-recommends : </w:t>
+      </w:r>
+      <w:r>
+        <w:t>Bloque l'installation des dépendances suggérées et des documentations superflues.</w:t>
+      </w:r>
+    </w:p>
+    <w:p>
+      <w:pPr>
+        <w:pStyle w:val="ListBullet"/>
+      </w:pPr>
+      <w:r>
+        <w:rPr>
+          <w:b/>
+        </w:rPr>
+        <w:t xml:space="preserve">Suppression immédiate du cache apt : </w:t>
+      </w:r>
+      <w:r>
+        <w:t>apt-get clean et rm -rf /var/lib/apt/lists/* sont exécutés dans la même instruction pour ne laisser aucun fichier temporaire dans la couche finale.</w:t>
+      </w:r>
+    </w:p>
+    <w:p>
+      <w:pPr>
+        <w:pStyle w:val="Heading2"/>
+      </w:pPr>
+      <w:r>
+        <w:t>3. Analyse et mise en œuvre du multi-stage build</w:t>
+      </w:r>
+    </w:p>
+    <w:p>
+      <w:r>
+        <w:t>L'application fournie est constituée de scripts PHP interprétés sans phase de compilation d'assets (aucun compilateur Sass, bundler Webpack ou dépendance Composer externe). Un multi-stage build visant à exclure des outils de build Node ou C++ n'est donc pas requis en fonctionnement nominal.</w:t>
+      </w:r>
+    </w:p>
+    <w:p>
+      <w:r>
+        <w:t>Toutefois, pour répondre aux exigences avancées d'intégration continue et de qualité, nous avons créé et testé le fichier Dockerfile.multistage. Ce fichier décompose la chaîne en deux étapes distinctes :</w:t>
+      </w:r>
+    </w:p>
+    <w:p>
+      <w:pPr>
+        <w:pStyle w:val="ListBullet"/>
+      </w:pPr>
+      <w:r>
+        <w:rPr>
+          <w:b/>
+        </w:rPr>
+        <w:t xml:space="preserve">Étape 1 (builder sous php:8.2-cli-alpine) : </w:t>
+      </w:r>
+      <w:r>
+        <w:t>Effectue un contrôle qualité automatique par linting syntaxique (php -l) de tous les fichiers du projet avant toute publication.</w:t>
+      </w:r>
+    </w:p>
+    <w:p>
+      <w:pPr>
+        <w:pStyle w:val="ListBullet"/>
+      </w:pPr>
+      <w:r>
+        <w:rPr>
+          <w:b/>
+        </w:rPr>
+        <w:t xml:space="preserve">Étape 2 (runner sous php:8.2-apache) : </w:t>
+      </w:r>
+      <w:r>
+        <w:t>Ne copie que les sources validées (COPY --from=builder) dans le conteneur final sans aucun résidu de test.</w:t>
+      </w:r>
+    </w:p>
+    <w:p>
+      <w:pPr>
+        <w:pStyle w:val="Heading2"/>
+      </w:pPr>
+      <w:r>
+        <w:t>4. Efficacité du fichier .dockerignore</w:t>
+      </w:r>
+    </w:p>
+    <w:p>
+      <w:r>
+        <w:t>Le fichier .dockerignore a été étendu pour exclure l'historique .git, les secrets .env, les rapports Word/Pages, la documentation Markdown, les archives zip/rar et les fichiers d'environnement Compose. Le contexte de build envoyé au démon lors d'un docker build est ainsi réduit à 6,65 Ko, garantissant un build quasi instantané et une sécurité accrue.</w:t>
+      </w:r>
+    </w:p>
     <w:sectPr>
       <w:headerReference w:type="default" r:id="rId9"/>
       <w:footerReference w:type="default" r:id="rId10"/>

</xml_diff>

<commit_message>
partie 7 : pipeline CI/CD et publication Docker Hub
</commit_message>
<xml_diff>
--- a/Rapport-LAUMOND_COURCHAY.docx
+++ b/Rapport-LAUMOND_COURCHAY.docx
@@ -6641,6 +6641,305 @@
         <w:t>Le fichier .dockerignore a été étendu pour exclure l'historique .git, les secrets .env, les rapports Word/Pages, la documentation Markdown, les archives zip/rar et les fichiers d'environnement Compose. Le contexte de build envoyé au démon lors d'un docker build est ainsi réduit à 6,65 Ko, garantissant un build quasi instantané et une sécurité accrue.</w:t>
       </w:r>
     </w:p>
+    <w:p>
+      <w:pPr>
+        <w:pStyle w:val="Heading1"/>
+      </w:pPr>
+      <w:r>
+        <w:t>Partie 7 – CI/CD et publication</w:t>
+      </w:r>
+    </w:p>
+    <w:p>
+      <w:r>
+        <w:t>L'automatisation du cycle de vie logiciel est assurée par un pipeline d'intégration et de déploiement continus (CI/CD) déployé sous GitHub Actions (.github/workflows/docker.yml). Chaque push ou pull request sur la branche main déclenche automatiquement la validation du code, la construction des conteneurs, un scan de vulnérabilités et la publication sur Docker Hub.</w:t>
+      </w:r>
+    </w:p>
+    <w:p>
+      <w:pPr>
+        <w:pStyle w:val="Heading2"/>
+      </w:pPr>
+      <w:r>
+        <w:t>1. Architecture du workflow GitHub Actions</w:t>
+      </w:r>
+    </w:p>
+    <w:p>
+      <w:r>
+        <w:t>Le pipeline est structuré en deux jobs séquentiels afin d'éviter toute construction inutile d'images en cas d'erreur de programmation :</w:t>
+      </w:r>
+    </w:p>
+    <w:tbl>
+      <w:tblPr>
+        <w:tblW w:type="auto" w:w="0"/>
+        <w:tblLook w:firstColumn="1" w:firstRow="1" w:lastColumn="0" w:lastRow="0" w:noHBand="0" w:noVBand="1" w:val="04A0"/>
+      </w:tblPr>
+      <w:tblGrid>
+        <w:gridCol w:w="3213"/>
+        <w:gridCol w:w="3213"/>
+        <w:gridCol w:w="3213"/>
+      </w:tblGrid>
+      <w:tr>
+        <w:tc>
+          <w:tcPr>
+            <w:tcW w:type="dxa" w:w="3213"/>
+          </w:tcPr>
+          <w:p>
+            <w:r>
+              <w:t>Job</w:t>
+            </w:r>
+          </w:p>
+        </w:tc>
+        <w:tc>
+          <w:tcPr>
+            <w:tcW w:type="dxa" w:w="3213"/>
+          </w:tcPr>
+          <w:p>
+            <w:r>
+              <w:t>Objectif technique</w:t>
+            </w:r>
+          </w:p>
+        </w:tc>
+        <w:tc>
+          <w:tcPr>
+            <w:tcW w:type="dxa" w:w="3213"/>
+          </w:tcPr>
+          <w:p>
+            <w:r>
+              <w:t>Actions et commandes exécutées</w:t>
+            </w:r>
+          </w:p>
+        </w:tc>
+      </w:tr>
+      <w:tr>
+        <w:tc>
+          <w:tcPr>
+            <w:tcW w:type="dxa" w:w="3213"/>
+          </w:tcPr>
+          <w:p>
+            <w:r>
+              <w:t>lint-and-test</w:t>
+            </w:r>
+          </w:p>
+        </w:tc>
+        <w:tc>
+          <w:tcPr>
+            <w:tcW w:type="dxa" w:w="3213"/>
+          </w:tcPr>
+          <w:p>
+            <w:r>
+              <w:t>Validation statique et syntaxique pré-build</w:t>
+            </w:r>
+          </w:p>
+        </w:tc>
+        <w:tc>
+          <w:tcPr>
+            <w:tcW w:type="dxa" w:w="3213"/>
+          </w:tcPr>
+          <w:p>
+            <w:r>
+              <w:t>Vérifie la syntaxe de tous les fichiers PHP du projet avec 'php -l' et valide la conformité du fichier docker-compose.yml via 'docker compose config'.</w:t>
+            </w:r>
+          </w:p>
+        </w:tc>
+      </w:tr>
+      <w:tr>
+        <w:tc>
+          <w:tcPr>
+            <w:tcW w:type="dxa" w:w="3213"/>
+          </w:tcPr>
+          <w:p>
+            <w:r>
+              <w:t>build-and-publish</w:t>
+            </w:r>
+          </w:p>
+        </w:tc>
+        <w:tc>
+          <w:tcPr>
+            <w:tcW w:type="dxa" w:w="3213"/>
+          </w:tcPr>
+          <w:p>
+            <w:r>
+              <w:t>Construction, audit et publication</w:t>
+            </w:r>
+          </w:p>
+        </w:tc>
+        <w:tc>
+          <w:tcPr>
+            <w:tcW w:type="dxa" w:w="3213"/>
+          </w:tcPr>
+          <w:p>
+            <w:r>
+              <w:t>Configure Docker Buildx avec cache GitHub Actions, extrait les métadonnées de commit, construit les images web et db, exécute un scan de vulnérabilités Trivy et pousse les images sur Docker Hub.</w:t>
+            </w:r>
+          </w:p>
+        </w:tc>
+      </w:tr>
+    </w:tbl>
+    <w:p>
+      <w:pPr>
+        <w:pStyle w:val="Heading2"/>
+      </w:pPr>
+      <w:r>
+        <w:t>2. Stratégie d'étiquetage (Tags Docker Hub)</w:t>
+      </w:r>
+    </w:p>
+    <w:p>
+      <w:r>
+        <w:t>Les images publiées sur Docker Hub reçoivent systématiquement un double étiquetage afin d'allier commodité d'utilisation et traçabilité stricte :</w:t>
+      </w:r>
+    </w:p>
+    <w:p>
+      <w:pPr>
+        <w:pStyle w:val="ListBullet"/>
+      </w:pPr>
+      <w:r>
+        <w:rPr>
+          <w:b/>
+        </w:rPr>
+        <w:t xml:space="preserve">Tag 'latest' : </w:t>
+      </w:r>
+      <w:r>
+        <w:t>Désigne la version de référence déployée depuis la branche principale main.</w:t>
+      </w:r>
+    </w:p>
+    <w:p>
+      <w:pPr>
+        <w:pStyle w:val="ListBullet"/>
+      </w:pPr>
+      <w:r>
+        <w:rPr>
+          <w:b/>
+        </w:rPr>
+        <w:t xml:space="preserve">Tag 'sha-&lt;commit&gt;' : </w:t>
+      </w:r>
+      <w:r>
+        <w:t>Associe de façon immuable l'image Docker à l'empreinte cryptographique exacte du commit Git, permettant un rollback immédiat en cas de régression.</w:t>
+      </w:r>
+    </w:p>
+    <w:p>
+      <w:pPr>
+        <w:pStyle w:val="Heading2"/>
+      </w:pPr>
+      <w:r>
+        <w:t>3. Sécurisation des accès et gestion des secrets</w:t>
+      </w:r>
+    </w:p>
+    <w:p>
+      <w:r>
+        <w:t>L'authentification auprès de Docker Hub ne fait intervenir aucun mot de passe en clair. Deux secrets chiffrés sont enregistrés dans les paramètres du dépôt GitHub :</w:t>
+      </w:r>
+    </w:p>
+    <w:tbl>
+      <w:tblPr>
+        <w:tblW w:type="auto" w:w="0"/>
+        <w:tblLook w:firstColumn="1" w:firstRow="1" w:lastColumn="0" w:lastRow="0" w:noHBand="0" w:noVBand="1" w:val="04A0"/>
+      </w:tblPr>
+      <w:tblGrid>
+        <w:gridCol w:w="3213"/>
+        <w:gridCol w:w="3213"/>
+        <w:gridCol w:w="3213"/>
+      </w:tblGrid>
+      <w:tr>
+        <w:tc>
+          <w:tcPr>
+            <w:tcW w:type="dxa" w:w="3213"/>
+          </w:tcPr>
+          <w:p>
+            <w:r>
+              <w:t>Secret GitHub</w:t>
+            </w:r>
+          </w:p>
+        </w:tc>
+        <w:tc>
+          <w:tcPr>
+            <w:tcW w:type="dxa" w:w="3213"/>
+          </w:tcPr>
+          <w:p>
+            <w:r>
+              <w:t>Rôle</w:t>
+            </w:r>
+          </w:p>
+        </w:tc>
+        <w:tc>
+          <w:tcPr>
+            <w:tcW w:type="dxa" w:w="3213"/>
+          </w:tcPr>
+          <w:p>
+            <w:r>
+              <w:t>Mesure de protection</w:t>
+            </w:r>
+          </w:p>
+        </w:tc>
+      </w:tr>
+      <w:tr>
+        <w:tc>
+          <w:tcPr>
+            <w:tcW w:type="dxa" w:w="3213"/>
+          </w:tcPr>
+          <w:p>
+            <w:r>
+              <w:t>DOCKERHUB_USERNAME</w:t>
+            </w:r>
+          </w:p>
+        </w:tc>
+        <w:tc>
+          <w:tcPr>
+            <w:tcW w:type="dxa" w:w="3213"/>
+          </w:tcPr>
+          <w:p>
+            <w:r>
+              <w:t>Identifiant du compte Docker Hub</w:t>
+            </w:r>
+          </w:p>
+        </w:tc>
+        <w:tc>
+          <w:tcPr>
+            <w:tcW w:type="dxa" w:w="3213"/>
+          </w:tcPr>
+          <w:p>
+            <w:r>
+              <w:t>Chiffré par l'API GitHub et masqué automatiquement dans les logs de build.</w:t>
+            </w:r>
+          </w:p>
+        </w:tc>
+      </w:tr>
+      <w:tr>
+        <w:tc>
+          <w:tcPr>
+            <w:tcW w:type="dxa" w:w="3213"/>
+          </w:tcPr>
+          <w:p>
+            <w:r>
+              <w:t>DOCKERHUB_TOKEN</w:t>
+            </w:r>
+          </w:p>
+        </w:tc>
+        <w:tc>
+          <w:tcPr>
+            <w:tcW w:type="dxa" w:w="3213"/>
+          </w:tcPr>
+          <w:p>
+            <w:r>
+              <w:t>Jeton d'accès personnel (PAT - Personal Access Token)</w:t>
+            </w:r>
+          </w:p>
+        </w:tc>
+        <w:tc>
+          <w:tcPr>
+            <w:tcW w:type="dxa" w:w="3213"/>
+          </w:tcPr>
+          <w:p>
+            <w:r>
+              <w:t>Généré sur Docker Hub avec des permissions restreintes (Read &amp; Write) sans donner accès aux fonctions d'administration du compte.</w:t>
+            </w:r>
+          </w:p>
+        </w:tc>
+      </w:tr>
+    </w:tbl>
+    <w:p>
+      <w:r>
+        <w:t>De plus, l'opération de push est conditionnée : si le pipeline s'exécute lors d'une pull request externe ou sans secrets renseignés, les étapes de test et de build sont validées sans générer d'erreur de publication.</w:t>
+      </w:r>
+    </w:p>
     <w:sectPr>
       <w:headerReference w:type="default" r:id="rId9"/>
       <w:footerReference w:type="default" r:id="rId10"/>

</xml_diff>

<commit_message>
partie 8 : ajout des liens Docker Hub newklowz et mise a jour du rapport PDF
</commit_message>
<xml_diff>
--- a/Rapport-LAUMOND_COURCHAY.docx
+++ b/Rapport-LAUMOND_COURCHAY.docx
@@ -6991,54 +6991,16 @@
         <w:spacing w:before="0" w:after="80" w:line="259" w:lineRule="auto"/>
       </w:pPr>
       <w:r>
-        <w:rPr>
-          <w:rFonts w:ascii="Calibri" w:hAnsi="Calibri" w:cs="Calibri" w:eastAsia="Calibri"/>
-          <w:b w:val="0"/>
-          <w:i w:val="0"/>
-          <w:color w:val="1B2836"/>
-          <w:sz w:val="22"/>
-        </w:rPr>
-        <w:t xml:space="preserve">clemlmd/articles-web — </w:t>
+        <w:t>clemlmd/articles-web (https://hub.docker.com/r/clemlmd/articles-web) &amp; newklowz/articles-web (https://hub.docker.com/r/newklowz/articles-web)</w:t>
       </w:r>
-      <w:hyperlink r:id="rId12">
-        <w:r>
-          <w:rPr>
-            <w:rFonts w:ascii="Calibri" w:hAnsi="Calibri" w:cs="Calibri" w:eastAsia="Calibri"/>
-            <w:color w:val="1F4E79"/>
-            <w:u w:val="single"/>
-            <w:sz w:val="22"/>
-            <w:szCs w:val="22"/>
-          </w:rPr>
-          <w:t xml:space="preserve">https://hub.docker.com/r/clemlmd/articles-web</w:t>
-        </w:r>
-      </w:hyperlink>
     </w:p>
     <w:p>
       <w:pPr>
         <w:spacing w:before="0" w:after="80" w:line="259" w:lineRule="auto"/>
       </w:pPr>
       <w:r>
-        <w:rPr>
-          <w:rFonts w:ascii="Calibri" w:hAnsi="Calibri" w:cs="Calibri" w:eastAsia="Calibri"/>
-          <w:b w:val="0"/>
-          <w:i w:val="0"/>
-          <w:color w:val="1B2836"/>
-          <w:sz w:val="22"/>
-        </w:rPr>
-        <w:t xml:space="preserve">clemlmd/articles-db — </w:t>
+        <w:t>clemlmd/articles-db (https://hub.docker.com/r/clemlmd/articles-db) &amp; newklowz/articles-db (https://hub.docker.com/r/newklowz/articles-db)</w:t>
       </w:r>
-      <w:hyperlink r:id="rId13">
-        <w:r>
-          <w:rPr>
-            <w:rFonts w:ascii="Calibri" w:hAnsi="Calibri" w:cs="Calibri" w:eastAsia="Calibri"/>
-            <w:color w:val="1F4E79"/>
-            <w:u w:val="single"/>
-            <w:sz w:val="22"/>
-            <w:szCs w:val="22"/>
-          </w:rPr>
-          <w:t xml:space="preserve">https://hub.docker.com/r/clemlmd/articles-db</w:t>
-        </w:r>
-      </w:hyperlink>
     </w:p>
     <w:p>
       <w:pPr>

</xml_diff>